<commit_message>
Expand calibration doc with per-camera/per-radar results
Add a results matrix (camera x radar x status) and both the finalized
(2026-07-22) and earlier validation (2026-07-15) numeric results for
radar1/radar2, plus an explicit note that the Arducam profile has no
recorded calibration session yet.

Co-Authored-By: Claude Sonnet 5 <noreply@anthropic.com>
Claude-Session: https://claude.ai/code/session_018XkZjzNVgaH2ptG7obxUcu
</commit_message>
<xml_diff>
--- a/radar_camera_calibration/docs/Radar_Calibration_Standardized_Procedure.docx
+++ b/radar_camera_calibration/docs/Radar_Calibration_Standardized_Procedure.docx
@@ -3911,8 +3911,821 @@
         <w:spacing w:after="140" w:before="280"/>
       </w:pPr>
       <w:r>
-        <w:t xml:space="preserve">5. Per-Radar Specifics</w:t>
+        <w:t xml:space="preserve">5. Calibration Results — Per Camera &amp; Per Radar</w:t>
       </w:r>
+    </w:p>
+    <w:p>
+      <w:pPr>
+        <w:spacing w:after="160"/>
+      </w:pPr>
+      <w:r>
+        <w:t xml:space="preserve">The procedure in Section 3 is camera-agnostic (Section 3.2/1a: ZED or Arducam, selected by a one-line profile swap), but to date every logged calibration session has been run against the ZED left camera. The Arducam profile (radar_camera_calib_arducam.py) is implemented and code-complete but has no recorded calibration session yet — see 5.4. All numeric results below are therefore T_cam_radar from zed_left_camera_optical_frame to each radarN_link.</w:t>
+      </w:r>
+    </w:p>
+    <w:tbl>
+      <w:tblPr>
+        <w:tblW w:type="dxa" w:w="9360"/>
+        <w:tblBorders>
+          <w:top w:val="single" w:color="auto" w:sz="4"/>
+          <w:left w:val="single" w:color="auto" w:sz="4"/>
+          <w:bottom w:val="single" w:color="auto" w:sz="4"/>
+          <w:right w:val="single" w:color="auto" w:sz="4"/>
+          <w:insideH w:val="single" w:color="auto" w:sz="4"/>
+          <w:insideV w:val="single" w:color="auto" w:sz="4"/>
+        </w:tblBorders>
+      </w:tblPr>
+      <w:tblGrid>
+        <w:gridCol w:w="1532"/>
+        <w:gridCol w:w="2042"/>
+        <w:gridCol w:w="2893"/>
+        <w:gridCol w:w="1361"/>
+        <w:gridCol w:w="1532"/>
+      </w:tblGrid>
+      <w:tr>
+        <w:tc>
+          <w:tcPr>
+            <w:tcW w:type="dxa" w:w="1532"/>
+            <w:tcBorders>
+              <w:top w:val="single" w:color="BFBFBF" w:sz="4"/>
+              <w:left w:val="single" w:color="BFBFBF" w:sz="4"/>
+              <w:bottom w:val="single" w:color="BFBFBF" w:sz="4"/>
+              <w:right w:val="single" w:color="BFBFBF" w:sz="4"/>
+            </w:tcBorders>
+            <w:shd w:fill="2F5496" w:val="clear"/>
+            <w:tcMar>
+              <w:top w:type="dxa" w:w="60"/>
+              <w:left w:type="dxa" w:w="100"/>
+              <w:bottom w:type="dxa" w:w="60"/>
+              <w:right w:type="dxa" w:w="100"/>
+            </w:tcMar>
+            <w:vAlign w:val="center"/>
+          </w:tcPr>
+          <w:p>
+            <w:pPr>
+              <w:jc w:val="left"/>
+            </w:pPr>
+            <w:r>
+              <w:rPr>
+                <w:b/>
+                <w:bCs/>
+                <w:color w:val="FFFFFF"/>
+                <w:sz w:val="19"/>
+                <w:szCs w:val="19"/>
+              </w:rPr>
+              <w:t xml:space="preserve">Camera</w:t>
+            </w:r>
+          </w:p>
+        </w:tc>
+        <w:tc>
+          <w:tcPr>
+            <w:tcW w:type="dxa" w:w="2042"/>
+            <w:tcBorders>
+              <w:top w:val="single" w:color="BFBFBF" w:sz="4"/>
+              <w:left w:val="single" w:color="BFBFBF" w:sz="4"/>
+              <w:bottom w:val="single" w:color="BFBFBF" w:sz="4"/>
+              <w:right w:val="single" w:color="BFBFBF" w:sz="4"/>
+            </w:tcBorders>
+            <w:shd w:fill="2F5496" w:val="clear"/>
+            <w:tcMar>
+              <w:top w:type="dxa" w:w="60"/>
+              <w:left w:type="dxa" w:w="100"/>
+              <w:bottom w:type="dxa" w:w="60"/>
+              <w:right w:type="dxa" w:w="100"/>
+            </w:tcMar>
+            <w:vAlign w:val="center"/>
+          </w:tcPr>
+          <w:p>
+            <w:pPr>
+              <w:jc w:val="left"/>
+            </w:pPr>
+            <w:r>
+              <w:rPr>
+                <w:b/>
+                <w:bCs/>
+                <w:color w:val="FFFFFF"/>
+                <w:sz w:val="19"/>
+                <w:szCs w:val="19"/>
+              </w:rPr>
+              <w:t xml:space="preserve">Radar</w:t>
+            </w:r>
+          </w:p>
+        </w:tc>
+        <w:tc>
+          <w:tcPr>
+            <w:tcW w:type="dxa" w:w="2893"/>
+            <w:tcBorders>
+              <w:top w:val="single" w:color="BFBFBF" w:sz="4"/>
+              <w:left w:val="single" w:color="BFBFBF" w:sz="4"/>
+              <w:bottom w:val="single" w:color="BFBFBF" w:sz="4"/>
+              <w:right w:val="single" w:color="BFBFBF" w:sz="4"/>
+            </w:tcBorders>
+            <w:shd w:fill="2F5496" w:val="clear"/>
+            <w:tcMar>
+              <w:top w:type="dxa" w:w="60"/>
+              <w:left w:type="dxa" w:w="100"/>
+              <w:bottom w:type="dxa" w:w="60"/>
+              <w:right w:type="dxa" w:w="100"/>
+            </w:tcMar>
+            <w:vAlign w:val="center"/>
+          </w:tcPr>
+          <w:p>
+            <w:pPr>
+              <w:jc w:val="left"/>
+            </w:pPr>
+            <w:r>
+              <w:rPr>
+                <w:b/>
+                <w:bCs/>
+                <w:color w:val="FFFFFF"/>
+                <w:sz w:val="19"/>
+                <w:szCs w:val="19"/>
+              </w:rPr>
+              <w:t xml:space="preserve">Latest status</w:t>
+            </w:r>
+          </w:p>
+        </w:tc>
+        <w:tc>
+          <w:tcPr>
+            <w:tcW w:type="dxa" w:w="1361"/>
+            <w:tcBorders>
+              <w:top w:val="single" w:color="BFBFBF" w:sz="4"/>
+              <w:left w:val="single" w:color="BFBFBF" w:sz="4"/>
+              <w:bottom w:val="single" w:color="BFBFBF" w:sz="4"/>
+              <w:right w:val="single" w:color="BFBFBF" w:sz="4"/>
+            </w:tcBorders>
+            <w:shd w:fill="2F5496" w:val="clear"/>
+            <w:tcMar>
+              <w:top w:type="dxa" w:w="60"/>
+              <w:left w:type="dxa" w:w="100"/>
+              <w:bottom w:type="dxa" w:w="60"/>
+              <w:right w:type="dxa" w:w="100"/>
+            </w:tcMar>
+            <w:vAlign w:val="center"/>
+          </w:tcPr>
+          <w:p>
+            <w:pPr>
+              <w:jc w:val="left"/>
+            </w:pPr>
+            <w:r>
+              <w:rPr>
+                <w:b/>
+                <w:bCs/>
+                <w:color w:val="FFFFFF"/>
+                <w:sz w:val="19"/>
+                <w:szCs w:val="19"/>
+              </w:rPr>
+              <w:t xml:space="preserve">Date</w:t>
+            </w:r>
+          </w:p>
+        </w:tc>
+        <w:tc>
+          <w:tcPr>
+            <w:tcW w:type="dxa" w:w="1532"/>
+            <w:tcBorders>
+              <w:top w:val="single" w:color="BFBFBF" w:sz="4"/>
+              <w:left w:val="single" w:color="BFBFBF" w:sz="4"/>
+              <w:bottom w:val="single" w:color="BFBFBF" w:sz="4"/>
+              <w:right w:val="single" w:color="BFBFBF" w:sz="4"/>
+            </w:tcBorders>
+            <w:shd w:fill="2F5496" w:val="clear"/>
+            <w:tcMar>
+              <w:top w:type="dxa" w:w="60"/>
+              <w:left w:type="dxa" w:w="100"/>
+              <w:bottom w:type="dxa" w:w="60"/>
+              <w:right w:type="dxa" w:w="100"/>
+            </w:tcMar>
+            <w:vAlign w:val="center"/>
+          </w:tcPr>
+          <w:p>
+            <w:pPr>
+              <w:jc w:val="left"/>
+            </w:pPr>
+            <w:r>
+              <w:rPr>
+                <w:b/>
+                <w:bCs/>
+                <w:color w:val="FFFFFF"/>
+                <w:sz w:val="19"/>
+                <w:szCs w:val="19"/>
+              </w:rPr>
+              <w:t xml:space="preserve">Deployable</w:t>
+            </w:r>
+          </w:p>
+        </w:tc>
+      </w:tr>
+      <w:tr>
+        <w:tc>
+          <w:tcPr>
+            <w:tcW w:type="dxa" w:w="1532"/>
+            <w:tcBorders>
+              <w:top w:val="single" w:color="BFBFBF" w:sz="4"/>
+              <w:left w:val="single" w:color="BFBFBF" w:sz="4"/>
+              <w:bottom w:val="single" w:color="BFBFBF" w:sz="4"/>
+              <w:right w:val="single" w:color="BFBFBF" w:sz="4"/>
+            </w:tcBorders>
+            <w:tcMar>
+              <w:top w:type="dxa" w:w="60"/>
+              <w:left w:type="dxa" w:w="100"/>
+              <w:bottom w:type="dxa" w:w="60"/>
+              <w:right w:type="dxa" w:w="100"/>
+            </w:tcMar>
+            <w:vAlign w:val="center"/>
+          </w:tcPr>
+          <w:p>
+            <w:pPr>
+              <w:jc w:val="left"/>
+            </w:pPr>
+            <w:r>
+              <w:rPr>
+                <w:sz w:val="19"/>
+                <w:szCs w:val="19"/>
+              </w:rPr>
+              <w:t xml:space="preserve">ZED left</w:t>
+            </w:r>
+          </w:p>
+        </w:tc>
+        <w:tc>
+          <w:tcPr>
+            <w:tcW w:type="dxa" w:w="2042"/>
+            <w:tcBorders>
+              <w:top w:val="single" w:color="BFBFBF" w:sz="4"/>
+              <w:left w:val="single" w:color="BFBFBF" w:sz="4"/>
+              <w:bottom w:val="single" w:color="BFBFBF" w:sz="4"/>
+              <w:right w:val="single" w:color="BFBFBF" w:sz="4"/>
+            </w:tcBorders>
+            <w:tcMar>
+              <w:top w:type="dxa" w:w="60"/>
+              <w:left w:type="dxa" w:w="100"/>
+              <w:bottom w:type="dxa" w:w="60"/>
+              <w:right w:type="dxa" w:w="100"/>
+            </w:tcMar>
+            <w:vAlign w:val="center"/>
+          </w:tcPr>
+          <w:p>
+            <w:pPr>
+              <w:jc w:val="left"/>
+            </w:pPr>
+            <w:r>
+              <w:rPr>
+                <w:sz w:val="19"/>
+                <w:szCs w:val="19"/>
+              </w:rPr>
+              <w:t xml:space="preserve">radar1</w:t>
+            </w:r>
+          </w:p>
+        </w:tc>
+        <w:tc>
+          <w:tcPr>
+            <w:tcW w:type="dxa" w:w="2893"/>
+            <w:tcBorders>
+              <w:top w:val="single" w:color="BFBFBF" w:sz="4"/>
+              <w:left w:val="single" w:color="BFBFBF" w:sz="4"/>
+              <w:bottom w:val="single" w:color="BFBFBF" w:sz="4"/>
+              <w:right w:val="single" w:color="BFBFBF" w:sz="4"/>
+            </w:tcBorders>
+            <w:tcMar>
+              <w:top w:type="dxa" w:w="60"/>
+              <w:left w:type="dxa" w:w="100"/>
+              <w:bottom w:type="dxa" w:w="60"/>
+              <w:right w:type="dxa" w:w="100"/>
+            </w:tcMar>
+            <w:vAlign w:val="center"/>
+          </w:tcPr>
+          <w:p>
+            <w:pPr>
+              <w:jc w:val="left"/>
+            </w:pPr>
+            <w:r>
+              <w:rPr>
+                <w:sz w:val="19"/>
+                <w:szCs w:val="19"/>
+              </w:rPr>
+              <w:t xml:space="preserve">Finalized — passes all Section 3.5 gates</w:t>
+            </w:r>
+          </w:p>
+        </w:tc>
+        <w:tc>
+          <w:tcPr>
+            <w:tcW w:type="dxa" w:w="1361"/>
+            <w:tcBorders>
+              <w:top w:val="single" w:color="BFBFBF" w:sz="4"/>
+              <w:left w:val="single" w:color="BFBFBF" w:sz="4"/>
+              <w:bottom w:val="single" w:color="BFBFBF" w:sz="4"/>
+              <w:right w:val="single" w:color="BFBFBF" w:sz="4"/>
+            </w:tcBorders>
+            <w:tcMar>
+              <w:top w:type="dxa" w:w="60"/>
+              <w:left w:type="dxa" w:w="100"/>
+              <w:bottom w:type="dxa" w:w="60"/>
+              <w:right w:type="dxa" w:w="100"/>
+            </w:tcMar>
+            <w:vAlign w:val="center"/>
+          </w:tcPr>
+          <w:p>
+            <w:pPr>
+              <w:jc w:val="left"/>
+            </w:pPr>
+            <w:r>
+              <w:rPr>
+                <w:sz w:val="19"/>
+                <w:szCs w:val="19"/>
+              </w:rPr>
+              <w:t xml:space="preserve">2026-07-22</w:t>
+            </w:r>
+          </w:p>
+        </w:tc>
+        <w:tc>
+          <w:tcPr>
+            <w:tcW w:type="dxa" w:w="1532"/>
+            <w:tcBorders>
+              <w:top w:val="single" w:color="BFBFBF" w:sz="4"/>
+              <w:left w:val="single" w:color="BFBFBF" w:sz="4"/>
+              <w:bottom w:val="single" w:color="BFBFBF" w:sz="4"/>
+              <w:right w:val="single" w:color="BFBFBF" w:sz="4"/>
+            </w:tcBorders>
+            <w:tcMar>
+              <w:top w:type="dxa" w:w="60"/>
+              <w:left w:type="dxa" w:w="100"/>
+              <w:bottom w:type="dxa" w:w="60"/>
+              <w:right w:type="dxa" w:w="100"/>
+            </w:tcMar>
+            <w:vAlign w:val="center"/>
+          </w:tcPr>
+          <w:p>
+            <w:pPr>
+              <w:jc w:val="left"/>
+            </w:pPr>
+            <w:r>
+              <w:rPr>
+                <w:sz w:val="19"/>
+                <w:szCs w:val="19"/>
+              </w:rPr>
+              <w:t xml:space="preserve">Yes</w:t>
+            </w:r>
+          </w:p>
+        </w:tc>
+      </w:tr>
+      <w:tr>
+        <w:tc>
+          <w:tcPr>
+            <w:tcW w:type="dxa" w:w="1532"/>
+            <w:tcBorders>
+              <w:top w:val="single" w:color="BFBFBF" w:sz="4"/>
+              <w:left w:val="single" w:color="BFBFBF" w:sz="4"/>
+              <w:bottom w:val="single" w:color="BFBFBF" w:sz="4"/>
+              <w:right w:val="single" w:color="BFBFBF" w:sz="4"/>
+            </w:tcBorders>
+            <w:tcMar>
+              <w:top w:type="dxa" w:w="60"/>
+              <w:left w:type="dxa" w:w="100"/>
+              <w:bottom w:type="dxa" w:w="60"/>
+              <w:right w:type="dxa" w:w="100"/>
+            </w:tcMar>
+            <w:vAlign w:val="center"/>
+          </w:tcPr>
+          <w:p>
+            <w:pPr>
+              <w:jc w:val="left"/>
+            </w:pPr>
+            <w:r>
+              <w:rPr>
+                <w:sz w:val="19"/>
+                <w:szCs w:val="19"/>
+              </w:rPr>
+              <w:t xml:space="preserve">ZED left</w:t>
+            </w:r>
+          </w:p>
+        </w:tc>
+        <w:tc>
+          <w:tcPr>
+            <w:tcW w:type="dxa" w:w="2042"/>
+            <w:tcBorders>
+              <w:top w:val="single" w:color="BFBFBF" w:sz="4"/>
+              <w:left w:val="single" w:color="BFBFBF" w:sz="4"/>
+              <w:bottom w:val="single" w:color="BFBFBF" w:sz="4"/>
+              <w:right w:val="single" w:color="BFBFBF" w:sz="4"/>
+            </w:tcBorders>
+            <w:tcMar>
+              <w:top w:type="dxa" w:w="60"/>
+              <w:left w:type="dxa" w:w="100"/>
+              <w:bottom w:type="dxa" w:w="60"/>
+              <w:right w:type="dxa" w:w="100"/>
+            </w:tcMar>
+            <w:vAlign w:val="center"/>
+          </w:tcPr>
+          <w:p>
+            <w:pPr>
+              <w:jc w:val="left"/>
+            </w:pPr>
+            <w:r>
+              <w:rPr>
+                <w:sz w:val="19"/>
+                <w:szCs w:val="19"/>
+              </w:rPr>
+              <w:t xml:space="preserve">radar2</w:t>
+            </w:r>
+          </w:p>
+        </w:tc>
+        <w:tc>
+          <w:tcPr>
+            <w:tcW w:type="dxa" w:w="2893"/>
+            <w:tcBorders>
+              <w:top w:val="single" w:color="BFBFBF" w:sz="4"/>
+              <w:left w:val="single" w:color="BFBFBF" w:sz="4"/>
+              <w:bottom w:val="single" w:color="BFBFBF" w:sz="4"/>
+              <w:right w:val="single" w:color="BFBFBF" w:sz="4"/>
+            </w:tcBorders>
+            <w:tcMar>
+              <w:top w:type="dxa" w:w="60"/>
+              <w:left w:type="dxa" w:w="100"/>
+              <w:bottom w:type="dxa" w:w="60"/>
+              <w:right w:type="dxa" w:w="100"/>
+            </w:tcMar>
+            <w:vAlign w:val="center"/>
+          </w:tcPr>
+          <w:p>
+            <w:pPr>
+              <w:jc w:val="left"/>
+            </w:pPr>
+            <w:r>
+              <w:rPr>
+                <w:sz w:val="19"/>
+                <w:szCs w:val="19"/>
+              </w:rPr>
+              <w:t xml:space="preserve">Finalized — passes all Section 3.5 gates</w:t>
+            </w:r>
+          </w:p>
+        </w:tc>
+        <w:tc>
+          <w:tcPr>
+            <w:tcW w:type="dxa" w:w="1361"/>
+            <w:tcBorders>
+              <w:top w:val="single" w:color="BFBFBF" w:sz="4"/>
+              <w:left w:val="single" w:color="BFBFBF" w:sz="4"/>
+              <w:bottom w:val="single" w:color="BFBFBF" w:sz="4"/>
+              <w:right w:val="single" w:color="BFBFBF" w:sz="4"/>
+            </w:tcBorders>
+            <w:tcMar>
+              <w:top w:type="dxa" w:w="60"/>
+              <w:left w:type="dxa" w:w="100"/>
+              <w:bottom w:type="dxa" w:w="60"/>
+              <w:right w:type="dxa" w:w="100"/>
+            </w:tcMar>
+            <w:vAlign w:val="center"/>
+          </w:tcPr>
+          <w:p>
+            <w:pPr>
+              <w:jc w:val="left"/>
+            </w:pPr>
+            <w:r>
+              <w:rPr>
+                <w:sz w:val="19"/>
+                <w:szCs w:val="19"/>
+              </w:rPr>
+              <w:t xml:space="preserve">2026-07-22</w:t>
+            </w:r>
+          </w:p>
+        </w:tc>
+        <w:tc>
+          <w:tcPr>
+            <w:tcW w:type="dxa" w:w="1532"/>
+            <w:tcBorders>
+              <w:top w:val="single" w:color="BFBFBF" w:sz="4"/>
+              <w:left w:val="single" w:color="BFBFBF" w:sz="4"/>
+              <w:bottom w:val="single" w:color="BFBFBF" w:sz="4"/>
+              <w:right w:val="single" w:color="BFBFBF" w:sz="4"/>
+            </w:tcBorders>
+            <w:tcMar>
+              <w:top w:type="dxa" w:w="60"/>
+              <w:left w:type="dxa" w:w="100"/>
+              <w:bottom w:type="dxa" w:w="60"/>
+              <w:right w:type="dxa" w:w="100"/>
+            </w:tcMar>
+            <w:vAlign w:val="center"/>
+          </w:tcPr>
+          <w:p>
+            <w:pPr>
+              <w:jc w:val="left"/>
+            </w:pPr>
+            <w:r>
+              <w:rPr>
+                <w:sz w:val="19"/>
+                <w:szCs w:val="19"/>
+              </w:rPr>
+              <w:t xml:space="preserve">Yes</w:t>
+            </w:r>
+          </w:p>
+        </w:tc>
+      </w:tr>
+      <w:tr>
+        <w:tc>
+          <w:tcPr>
+            <w:tcW w:type="dxa" w:w="1532"/>
+            <w:tcBorders>
+              <w:top w:val="single" w:color="BFBFBF" w:sz="4"/>
+              <w:left w:val="single" w:color="BFBFBF" w:sz="4"/>
+              <w:bottom w:val="single" w:color="BFBFBF" w:sz="4"/>
+              <w:right w:val="single" w:color="BFBFBF" w:sz="4"/>
+            </w:tcBorders>
+            <w:tcMar>
+              <w:top w:type="dxa" w:w="60"/>
+              <w:left w:type="dxa" w:w="100"/>
+              <w:bottom w:type="dxa" w:w="60"/>
+              <w:right w:type="dxa" w:w="100"/>
+            </w:tcMar>
+            <w:vAlign w:val="center"/>
+          </w:tcPr>
+          <w:p>
+            <w:pPr>
+              <w:jc w:val="left"/>
+            </w:pPr>
+            <w:r>
+              <w:rPr>
+                <w:sz w:val="19"/>
+                <w:szCs w:val="19"/>
+              </w:rPr>
+              <w:t xml:space="preserve">ZED left</w:t>
+            </w:r>
+          </w:p>
+        </w:tc>
+        <w:tc>
+          <w:tcPr>
+            <w:tcW w:type="dxa" w:w="2042"/>
+            <w:tcBorders>
+              <w:top w:val="single" w:color="BFBFBF" w:sz="4"/>
+              <w:left w:val="single" w:color="BFBFBF" w:sz="4"/>
+              <w:bottom w:val="single" w:color="BFBFBF" w:sz="4"/>
+              <w:right w:val="single" w:color="BFBFBF" w:sz="4"/>
+            </w:tcBorders>
+            <w:tcMar>
+              <w:top w:type="dxa" w:w="60"/>
+              <w:left w:type="dxa" w:w="100"/>
+              <w:bottom w:type="dxa" w:w="60"/>
+              <w:right w:type="dxa" w:w="100"/>
+            </w:tcMar>
+            <w:vAlign w:val="center"/>
+          </w:tcPr>
+          <w:p>
+            <w:pPr>
+              <w:jc w:val="left"/>
+            </w:pPr>
+            <w:r>
+              <w:rPr>
+                <w:sz w:val="19"/>
+                <w:szCs w:val="19"/>
+              </w:rPr>
+              <w:t xml:space="preserve">radar_infra</w:t>
+            </w:r>
+          </w:p>
+        </w:tc>
+        <w:tc>
+          <w:tcPr>
+            <w:tcW w:type="dxa" w:w="2893"/>
+            <w:tcBorders>
+              <w:top w:val="single" w:color="BFBFBF" w:sz="4"/>
+              <w:left w:val="single" w:color="BFBFBF" w:sz="4"/>
+              <w:bottom w:val="single" w:color="BFBFBF" w:sz="4"/>
+              <w:right w:val="single" w:color="BFBFBF" w:sz="4"/>
+            </w:tcBorders>
+            <w:tcMar>
+              <w:top w:type="dxa" w:w="60"/>
+              <w:left w:type="dxa" w:w="100"/>
+              <w:bottom w:type="dxa" w:w="60"/>
+              <w:right w:type="dxa" w:w="100"/>
+            </w:tcMar>
+            <w:vAlign w:val="center"/>
+          </w:tcPr>
+          <w:p>
+            <w:pPr>
+              <w:jc w:val="left"/>
+            </w:pPr>
+            <w:r>
+              <w:rPr>
+                <w:sz w:val="19"/>
+                <w:szCs w:val="19"/>
+              </w:rPr>
+              <w:t xml:space="preserve">Round-1 bootstrap only</w:t>
+            </w:r>
+          </w:p>
+        </w:tc>
+        <w:tc>
+          <w:tcPr>
+            <w:tcW w:type="dxa" w:w="1361"/>
+            <w:tcBorders>
+              <w:top w:val="single" w:color="BFBFBF" w:sz="4"/>
+              <w:left w:val="single" w:color="BFBFBF" w:sz="4"/>
+              <w:bottom w:val="single" w:color="BFBFBF" w:sz="4"/>
+              <w:right w:val="single" w:color="BFBFBF" w:sz="4"/>
+            </w:tcBorders>
+            <w:tcMar>
+              <w:top w:type="dxa" w:w="60"/>
+              <w:left w:type="dxa" w:w="100"/>
+              <w:bottom w:type="dxa" w:w="60"/>
+              <w:right w:type="dxa" w:w="100"/>
+            </w:tcMar>
+            <w:vAlign w:val="center"/>
+          </w:tcPr>
+          <w:p>
+            <w:pPr>
+              <w:jc w:val="left"/>
+            </w:pPr>
+            <w:r>
+              <w:rPr>
+                <w:sz w:val="19"/>
+                <w:szCs w:val="19"/>
+              </w:rPr>
+              <w:t xml:space="preserve">2026-07-15</w:t>
+            </w:r>
+          </w:p>
+        </w:tc>
+        <w:tc>
+          <w:tcPr>
+            <w:tcW w:type="dxa" w:w="1532"/>
+            <w:tcBorders>
+              <w:top w:val="single" w:color="BFBFBF" w:sz="4"/>
+              <w:left w:val="single" w:color="BFBFBF" w:sz="4"/>
+              <w:bottom w:val="single" w:color="BFBFBF" w:sz="4"/>
+              <w:right w:val="single" w:color="BFBFBF" w:sz="4"/>
+            </w:tcBorders>
+            <w:tcMar>
+              <w:top w:type="dxa" w:w="60"/>
+              <w:left w:type="dxa" w:w="100"/>
+              <w:bottom w:type="dxa" w:w="60"/>
+              <w:right w:type="dxa" w:w="100"/>
+            </w:tcMar>
+            <w:vAlign w:val="center"/>
+          </w:tcPr>
+          <w:p>
+            <w:pPr>
+              <w:jc w:val="left"/>
+            </w:pPr>
+            <w:r>
+              <w:rPr>
+                <w:sz w:val="19"/>
+                <w:szCs w:val="19"/>
+              </w:rPr>
+              <w:t xml:space="preserve">No</w:t>
+            </w:r>
+          </w:p>
+        </w:tc>
+      </w:tr>
+      <w:tr>
+        <w:tc>
+          <w:tcPr>
+            <w:tcW w:type="dxa" w:w="1532"/>
+            <w:tcBorders>
+              <w:top w:val="single" w:color="BFBFBF" w:sz="4"/>
+              <w:left w:val="single" w:color="BFBFBF" w:sz="4"/>
+              <w:bottom w:val="single" w:color="BFBFBF" w:sz="4"/>
+              <w:right w:val="single" w:color="BFBFBF" w:sz="4"/>
+            </w:tcBorders>
+            <w:tcMar>
+              <w:top w:type="dxa" w:w="60"/>
+              <w:left w:type="dxa" w:w="100"/>
+              <w:bottom w:type="dxa" w:w="60"/>
+              <w:right w:type="dxa" w:w="100"/>
+            </w:tcMar>
+            <w:vAlign w:val="center"/>
+          </w:tcPr>
+          <w:p>
+            <w:pPr>
+              <w:jc w:val="left"/>
+            </w:pPr>
+            <w:r>
+              <w:rPr>
+                <w:sz w:val="19"/>
+                <w:szCs w:val="19"/>
+              </w:rPr>
+              <w:t xml:space="preserve">Arducam</w:t>
+            </w:r>
+          </w:p>
+        </w:tc>
+        <w:tc>
+          <w:tcPr>
+            <w:tcW w:type="dxa" w:w="2042"/>
+            <w:tcBorders>
+              <w:top w:val="single" w:color="BFBFBF" w:sz="4"/>
+              <w:left w:val="single" w:color="BFBFBF" w:sz="4"/>
+              <w:bottom w:val="single" w:color="BFBFBF" w:sz="4"/>
+              <w:right w:val="single" w:color="BFBFBF" w:sz="4"/>
+            </w:tcBorders>
+            <w:tcMar>
+              <w:top w:type="dxa" w:w="60"/>
+              <w:left w:type="dxa" w:w="100"/>
+              <w:bottom w:type="dxa" w:w="60"/>
+              <w:right w:type="dxa" w:w="100"/>
+            </w:tcMar>
+            <w:vAlign w:val="center"/>
+          </w:tcPr>
+          <w:p>
+            <w:pPr>
+              <w:jc w:val="left"/>
+            </w:pPr>
+            <w:r>
+              <w:rPr>
+                <w:sz w:val="19"/>
+                <w:szCs w:val="19"/>
+              </w:rPr>
+              <w:t xml:space="preserve">radar1 / radar2 / radar_infra</w:t>
+            </w:r>
+          </w:p>
+        </w:tc>
+        <w:tc>
+          <w:tcPr>
+            <w:tcW w:type="dxa" w:w="2893"/>
+            <w:tcBorders>
+              <w:top w:val="single" w:color="BFBFBF" w:sz="4"/>
+              <w:left w:val="single" w:color="BFBFBF" w:sz="4"/>
+              <w:bottom w:val="single" w:color="BFBFBF" w:sz="4"/>
+              <w:right w:val="single" w:color="BFBFBF" w:sz="4"/>
+            </w:tcBorders>
+            <w:tcMar>
+              <w:top w:type="dxa" w:w="60"/>
+              <w:left w:type="dxa" w:w="100"/>
+              <w:bottom w:type="dxa" w:w="60"/>
+              <w:right w:type="dxa" w:w="100"/>
+            </w:tcMar>
+            <w:vAlign w:val="center"/>
+          </w:tcPr>
+          <w:p>
+            <w:pPr>
+              <w:jc w:val="left"/>
+            </w:pPr>
+            <w:r>
+              <w:rPr>
+                <w:sz w:val="19"/>
+                <w:szCs w:val="19"/>
+              </w:rPr>
+              <w:t xml:space="preserve">Not yet run — no session recorded</w:t>
+            </w:r>
+          </w:p>
+        </w:tc>
+        <w:tc>
+          <w:tcPr>
+            <w:tcW w:type="dxa" w:w="1361"/>
+            <w:tcBorders>
+              <w:top w:val="single" w:color="BFBFBF" w:sz="4"/>
+              <w:left w:val="single" w:color="BFBFBF" w:sz="4"/>
+              <w:bottom w:val="single" w:color="BFBFBF" w:sz="4"/>
+              <w:right w:val="single" w:color="BFBFBF" w:sz="4"/>
+            </w:tcBorders>
+            <w:tcMar>
+              <w:top w:type="dxa" w:w="60"/>
+              <w:left w:type="dxa" w:w="100"/>
+              <w:bottom w:type="dxa" w:w="60"/>
+              <w:right w:type="dxa" w:w="100"/>
+            </w:tcMar>
+            <w:vAlign w:val="center"/>
+          </w:tcPr>
+          <w:p>
+            <w:pPr>
+              <w:jc w:val="left"/>
+            </w:pPr>
+            <w:r>
+              <w:rPr>
+                <w:sz w:val="19"/>
+                <w:szCs w:val="19"/>
+              </w:rPr>
+              <w:t xml:space="preserve">—</w:t>
+            </w:r>
+          </w:p>
+        </w:tc>
+        <w:tc>
+          <w:tcPr>
+            <w:tcW w:type="dxa" w:w="1532"/>
+            <w:tcBorders>
+              <w:top w:val="single" w:color="BFBFBF" w:sz="4"/>
+              <w:left w:val="single" w:color="BFBFBF" w:sz="4"/>
+              <w:bottom w:val="single" w:color="BFBFBF" w:sz="4"/>
+              <w:right w:val="single" w:color="BFBFBF" w:sz="4"/>
+            </w:tcBorders>
+            <w:tcMar>
+              <w:top w:type="dxa" w:w="60"/>
+              <w:left w:type="dxa" w:w="100"/>
+              <w:bottom w:type="dxa" w:w="60"/>
+              <w:right w:type="dxa" w:w="100"/>
+            </w:tcMar>
+            <w:vAlign w:val="center"/>
+          </w:tcPr>
+          <w:p>
+            <w:pPr>
+              <w:jc w:val="left"/>
+            </w:pPr>
+            <w:r>
+              <w:rPr>
+                <w:sz w:val="19"/>
+                <w:szCs w:val="19"/>
+              </w:rPr>
+              <w:t xml:space="preserve">No</w:t>
+            </w:r>
+          </w:p>
+        </w:tc>
+      </w:tr>
+    </w:tbl>
+    <w:p>
+      <w:pPr>
+        <w:spacing w:after="120"/>
+      </w:pPr>
     </w:p>
     <w:p>
       <w:pPr>
@@ -3920,7 +4733,7 @@
         <w:spacing w:after="140" w:before="280"/>
       </w:pPr>
       <w:r>
-        <w:t xml:space="preserve">5.1 Radar1</w:t>
+        <w:t xml:space="preserve">5.1 ZED ↔ Radar1</w:t>
       </w:r>
     </w:p>
     <w:p>
@@ -3928,7 +4741,15 @@
         <w:spacing w:after="160"/>
       </w:pPr>
       <w:r>
-        <w:t xml:space="preserve">Mount: top UP (nominal, unrolled). This is the reference orientation the other radar is compared against.</w:t>
+        <w:t xml:space="preserve">Mount: top UP (nominal, unrolled). This is the reference orientation radar2 is compared against.</w:t>
+      </w:r>
+    </w:p>
+    <w:p>
+      <w:pPr>
+        <w:spacing w:after="160"/>
+      </w:pPr>
+      <w:r>
+        <w:t xml:space="preserve">Final result — standardized protocol, 2026-07-22 (deployable):</w:t>
       </w:r>
     </w:p>
     <w:tbl>
@@ -4044,68 +4865,6 @@
                 <w:sz w:val="19"/>
                 <w:szCs w:val="19"/>
               </w:rPr>
-              <w:t xml:space="preserve">Status</w:t>
-            </w:r>
-          </w:p>
-        </w:tc>
-        <w:tc>
-          <w:tcPr>
-            <w:tcW w:type="dxa" w:w="5200"/>
-            <w:tcBorders>
-              <w:top w:val="single" w:color="BFBFBF" w:sz="4"/>
-              <w:left w:val="single" w:color="BFBFBF" w:sz="4"/>
-              <w:bottom w:val="single" w:color="BFBFBF" w:sz="4"/>
-              <w:right w:val="single" w:color="BFBFBF" w:sz="4"/>
-            </w:tcBorders>
-            <w:tcMar>
-              <w:top w:type="dxa" w:w="60"/>
-              <w:left w:type="dxa" w:w="100"/>
-              <w:bottom w:type="dxa" w:w="60"/>
-              <w:right w:type="dxa" w:w="100"/>
-            </w:tcMar>
-            <w:vAlign w:val="center"/>
-          </w:tcPr>
-          <w:p>
-            <w:pPr>
-              <w:jc w:val="left"/>
-            </w:pPr>
-            <w:r>
-              <w:rPr>
-                <w:sz w:val="19"/>
-                <w:szCs w:val="19"/>
-              </w:rPr>
-              <w:t xml:space="preserve">Finalized under the standardized protocol (2026-07-22)</w:t>
-            </w:r>
-          </w:p>
-        </w:tc>
-      </w:tr>
-      <w:tr>
-        <w:tc>
-          <w:tcPr>
-            <w:tcW w:type="dxa" w:w="4160"/>
-            <w:tcBorders>
-              <w:top w:val="single" w:color="BFBFBF" w:sz="4"/>
-              <w:left w:val="single" w:color="BFBFBF" w:sz="4"/>
-              <w:bottom w:val="single" w:color="BFBFBF" w:sz="4"/>
-              <w:right w:val="single" w:color="BFBFBF" w:sz="4"/>
-            </w:tcBorders>
-            <w:tcMar>
-              <w:top w:type="dxa" w:w="60"/>
-              <w:left w:type="dxa" w:w="100"/>
-              <w:bottom w:type="dxa" w:w="60"/>
-              <w:right w:type="dxa" w:w="100"/>
-            </w:tcMar>
-            <w:vAlign w:val="center"/>
-          </w:tcPr>
-          <w:p>
-            <w:pPr>
-              <w:jc w:val="left"/>
-            </w:pPr>
-            <w:r>
-              <w:rPr>
-                <w:sz w:val="19"/>
-                <w:szCs w:val="19"/>
-              </w:rPr>
               <w:t xml:space="preserve">Translation t (m)</w:t>
             </w:r>
           </w:p>
@@ -4707,19 +5466,10 @@
     </w:p>
     <w:p>
       <w:pPr>
-        <w:pStyle w:val="Heading2"/>
-        <w:spacing w:after="140" w:before="280"/>
-      </w:pPr>
-      <w:r>
-        <w:t xml:space="preserve">5.2 Radar2</w:t>
-      </w:r>
-    </w:p>
-    <w:p>
-      <w:pPr>
         <w:spacing w:after="160"/>
       </w:pPr>
       <w:r>
-        <w:t xml:space="preserve">Mount: rolled ~87–90° clockwise about boresight vs. radar1 (top points RIGHT) — an intentional orthogonal mount so its weak angular axis is perpendicular to radar1's.</w:t>
+        <w:t xml:space="preserve">Earlier validation result — 2026-07-15, 31 poses, pre-standardized-protocol run (superseded by the 2026-07-22 result above, shown for the record):</w:t>
       </w:r>
     </w:p>
     <w:tbl>
@@ -4835,7 +5585,7 @@
                 <w:sz w:val="19"/>
                 <w:szCs w:val="19"/>
               </w:rPr>
-              <w:t xml:space="preserve">Status</w:t>
+              <w:t xml:space="preserve">Translation t (m)</w:t>
             </w:r>
           </w:p>
         </w:tc>
@@ -4865,7 +5615,7 @@
                 <w:sz w:val="19"/>
                 <w:szCs w:val="19"/>
               </w:rPr>
-              <w:t xml:space="preserve">Finalized under the standardized protocol (2026-07-22)</w:t>
+              <w:t xml:space="preserve">[+0.2218, −0.0067, −0.1721]   (|t| = 28.1 cm)</w:t>
             </w:r>
           </w:p>
         </w:tc>
@@ -4897,6 +5647,696 @@
                 <w:sz w:val="19"/>
                 <w:szCs w:val="19"/>
               </w:rPr>
+              <w:t xml:space="preserve">Quaternion (xyzw)</w:t>
+            </w:r>
+          </w:p>
+        </w:tc>
+        <w:tc>
+          <w:tcPr>
+            <w:tcW w:type="dxa" w:w="5200"/>
+            <w:tcBorders>
+              <w:top w:val="single" w:color="BFBFBF" w:sz="4"/>
+              <w:left w:val="single" w:color="BFBFBF" w:sz="4"/>
+              <w:bottom w:val="single" w:color="BFBFBF" w:sz="4"/>
+              <w:right w:val="single" w:color="BFBFBF" w:sz="4"/>
+            </w:tcBorders>
+            <w:tcMar>
+              <w:top w:type="dxa" w:w="60"/>
+              <w:left w:type="dxa" w:w="100"/>
+              <w:bottom w:type="dxa" w:w="60"/>
+              <w:right w:type="dxa" w:w="100"/>
+            </w:tcMar>
+            <w:vAlign w:val="center"/>
+          </w:tcPr>
+          <w:p>
+            <w:pPr>
+              <w:jc w:val="left"/>
+            </w:pPr>
+            <w:r>
+              <w:rPr>
+                <w:sz w:val="19"/>
+                <w:szCs w:val="19"/>
+              </w:rPr>
+              <w:t xml:space="preserve">[−0.5345, +0.5853, −0.4196, −0.4424]</w:t>
+            </w:r>
+          </w:p>
+        </w:tc>
+      </w:tr>
+      <w:tr>
+        <w:tc>
+          <w:tcPr>
+            <w:tcW w:type="dxa" w:w="4160"/>
+            <w:tcBorders>
+              <w:top w:val="single" w:color="BFBFBF" w:sz="4"/>
+              <w:left w:val="single" w:color="BFBFBF" w:sz="4"/>
+              <w:bottom w:val="single" w:color="BFBFBF" w:sz="4"/>
+              <w:right w:val="single" w:color="BFBFBF" w:sz="4"/>
+            </w:tcBorders>
+            <w:tcMar>
+              <w:top w:type="dxa" w:w="60"/>
+              <w:left w:type="dxa" w:w="100"/>
+              <w:bottom w:type="dxa" w:w="60"/>
+              <w:right w:type="dxa" w:w="100"/>
+            </w:tcMar>
+            <w:vAlign w:val="center"/>
+          </w:tcPr>
+          <w:p>
+            <w:pPr>
+              <w:jc w:val="left"/>
+            </w:pPr>
+            <w:r>
+              <w:rPr>
+                <w:sz w:val="19"/>
+                <w:szCs w:val="19"/>
+              </w:rPr>
+              <w:t xml:space="preserve">radar_range_scale</w:t>
+            </w:r>
+          </w:p>
+        </w:tc>
+        <w:tc>
+          <w:tcPr>
+            <w:tcW w:type="dxa" w:w="5200"/>
+            <w:tcBorders>
+              <w:top w:val="single" w:color="BFBFBF" w:sz="4"/>
+              <w:left w:val="single" w:color="BFBFBF" w:sz="4"/>
+              <w:bottom w:val="single" w:color="BFBFBF" w:sz="4"/>
+              <w:right w:val="single" w:color="BFBFBF" w:sz="4"/>
+            </w:tcBorders>
+            <w:tcMar>
+              <w:top w:type="dxa" w:w="60"/>
+              <w:left w:type="dxa" w:w="100"/>
+              <w:bottom w:type="dxa" w:w="60"/>
+              <w:right w:type="dxa" w:w="100"/>
+            </w:tcMar>
+            <w:vAlign w:val="center"/>
+          </w:tcPr>
+          <w:p>
+            <w:pPr>
+              <w:jc w:val="left"/>
+            </w:pPr>
+            <w:r>
+              <w:rPr>
+                <w:sz w:val="19"/>
+                <w:szCs w:val="19"/>
+              </w:rPr>
+              <w:t xml:space="preserve">1.039</w:t>
+            </w:r>
+          </w:p>
+        </w:tc>
+      </w:tr>
+      <w:tr>
+        <w:tc>
+          <w:tcPr>
+            <w:tcW w:type="dxa" w:w="4160"/>
+            <w:tcBorders>
+              <w:top w:val="single" w:color="BFBFBF" w:sz="4"/>
+              <w:left w:val="single" w:color="BFBFBF" w:sz="4"/>
+              <w:bottom w:val="single" w:color="BFBFBF" w:sz="4"/>
+              <w:right w:val="single" w:color="BFBFBF" w:sz="4"/>
+            </w:tcBorders>
+            <w:tcMar>
+              <w:top w:type="dxa" w:w="60"/>
+              <w:left w:type="dxa" w:w="100"/>
+              <w:bottom w:type="dxa" w:w="60"/>
+              <w:right w:type="dxa" w:w="100"/>
+            </w:tcMar>
+            <w:vAlign w:val="center"/>
+          </w:tcPr>
+          <w:p>
+            <w:pPr>
+              <w:jc w:val="left"/>
+            </w:pPr>
+            <w:r>
+              <w:rPr>
+                <w:sz w:val="19"/>
+                <w:szCs w:val="19"/>
+              </w:rPr>
+              <w:t xml:space="preserve">Rotation 1σ (deg)</w:t>
+            </w:r>
+          </w:p>
+        </w:tc>
+        <w:tc>
+          <w:tcPr>
+            <w:tcW w:type="dxa" w:w="5200"/>
+            <w:tcBorders>
+              <w:top w:val="single" w:color="BFBFBF" w:sz="4"/>
+              <w:left w:val="single" w:color="BFBFBF" w:sz="4"/>
+              <w:bottom w:val="single" w:color="BFBFBF" w:sz="4"/>
+              <w:right w:val="single" w:color="BFBFBF" w:sz="4"/>
+            </w:tcBorders>
+            <w:tcMar>
+              <w:top w:type="dxa" w:w="60"/>
+              <w:left w:type="dxa" w:w="100"/>
+              <w:bottom w:type="dxa" w:w="60"/>
+              <w:right w:type="dxa" w:w="100"/>
+            </w:tcMar>
+            <w:vAlign w:val="center"/>
+          </w:tcPr>
+          <w:p>
+            <w:pPr>
+              <w:jc w:val="left"/>
+            </w:pPr>
+            <w:r>
+              <w:rPr>
+                <w:sz w:val="19"/>
+                <w:szCs w:val="19"/>
+              </w:rPr>
+              <w:t xml:space="preserve">[4.09, 3.16, 3.12]</w:t>
+            </w:r>
+          </w:p>
+        </w:tc>
+      </w:tr>
+      <w:tr>
+        <w:tc>
+          <w:tcPr>
+            <w:tcW w:type="dxa" w:w="4160"/>
+            <w:tcBorders>
+              <w:top w:val="single" w:color="BFBFBF" w:sz="4"/>
+              <w:left w:val="single" w:color="BFBFBF" w:sz="4"/>
+              <w:bottom w:val="single" w:color="BFBFBF" w:sz="4"/>
+              <w:right w:val="single" w:color="BFBFBF" w:sz="4"/>
+            </w:tcBorders>
+            <w:tcMar>
+              <w:top w:type="dxa" w:w="60"/>
+              <w:left w:type="dxa" w:w="100"/>
+              <w:bottom w:type="dxa" w:w="60"/>
+              <w:right w:type="dxa" w:w="100"/>
+            </w:tcMar>
+            <w:vAlign w:val="center"/>
+          </w:tcPr>
+          <w:p>
+            <w:pPr>
+              <w:jc w:val="left"/>
+            </w:pPr>
+            <w:r>
+              <w:rPr>
+                <w:sz w:val="19"/>
+                <w:szCs w:val="19"/>
+              </w:rPr>
+              <w:t xml:space="preserve">Translation 1σ (mm)</w:t>
+            </w:r>
+          </w:p>
+        </w:tc>
+        <w:tc>
+          <w:tcPr>
+            <w:tcW w:type="dxa" w:w="5200"/>
+            <w:tcBorders>
+              <w:top w:val="single" w:color="BFBFBF" w:sz="4"/>
+              <w:left w:val="single" w:color="BFBFBF" w:sz="4"/>
+              <w:bottom w:val="single" w:color="BFBFBF" w:sz="4"/>
+              <w:right w:val="single" w:color="BFBFBF" w:sz="4"/>
+            </w:tcBorders>
+            <w:tcMar>
+              <w:top w:type="dxa" w:w="60"/>
+              <w:left w:type="dxa" w:w="100"/>
+              <w:bottom w:type="dxa" w:w="60"/>
+              <w:right w:type="dxa" w:w="100"/>
+            </w:tcMar>
+            <w:vAlign w:val="center"/>
+          </w:tcPr>
+          <w:p>
+            <w:pPr>
+              <w:jc w:val="left"/>
+            </w:pPr>
+            <w:r>
+              <w:rPr>
+                <w:sz w:val="19"/>
+                <w:szCs w:val="19"/>
+              </w:rPr>
+              <w:t xml:space="preserve">[33.0, 39.5, 37.9]</w:t>
+            </w:r>
+          </w:p>
+        </w:tc>
+      </w:tr>
+      <w:tr>
+        <w:tc>
+          <w:tcPr>
+            <w:tcW w:type="dxa" w:w="4160"/>
+            <w:tcBorders>
+              <w:top w:val="single" w:color="BFBFBF" w:sz="4"/>
+              <w:left w:val="single" w:color="BFBFBF" w:sz="4"/>
+              <w:bottom w:val="single" w:color="BFBFBF" w:sz="4"/>
+              <w:right w:val="single" w:color="BFBFBF" w:sz="4"/>
+            </w:tcBorders>
+            <w:tcMar>
+              <w:top w:type="dxa" w:w="60"/>
+              <w:left w:type="dxa" w:w="100"/>
+              <w:bottom w:type="dxa" w:w="60"/>
+              <w:right w:type="dxa" w:w="100"/>
+            </w:tcMar>
+            <w:vAlign w:val="center"/>
+          </w:tcPr>
+          <w:p>
+            <w:pPr>
+              <w:jc w:val="left"/>
+            </w:pPr>
+            <w:r>
+              <w:rPr>
+                <w:sz w:val="19"/>
+                <w:szCs w:val="19"/>
+              </w:rPr>
+              <w:t xml:space="preserve">Apex offset (m)</w:t>
+            </w:r>
+          </w:p>
+        </w:tc>
+        <w:tc>
+          <w:tcPr>
+            <w:tcW w:type="dxa" w:w="5200"/>
+            <w:tcBorders>
+              <w:top w:val="single" w:color="BFBFBF" w:sz="4"/>
+              <w:left w:val="single" w:color="BFBFBF" w:sz="4"/>
+              <w:bottom w:val="single" w:color="BFBFBF" w:sz="4"/>
+              <w:right w:val="single" w:color="BFBFBF" w:sz="4"/>
+            </w:tcBorders>
+            <w:tcMar>
+              <w:top w:type="dxa" w:w="60"/>
+              <w:left w:type="dxa" w:w="100"/>
+              <w:bottom w:type="dxa" w:w="60"/>
+              <w:right w:type="dxa" w:w="100"/>
+            </w:tcMar>
+            <w:vAlign w:val="center"/>
+          </w:tcPr>
+          <w:p>
+            <w:pPr>
+              <w:jc w:val="left"/>
+            </w:pPr>
+            <w:r>
+              <w:rPr>
+                <w:sz w:val="19"/>
+                <w:szCs w:val="19"/>
+              </w:rPr>
+              <w:t xml:space="preserve">[+0.288, +0.614, −0.009], 1σ [23, 21, 38] mm</w:t>
+            </w:r>
+          </w:p>
+        </w:tc>
+      </w:tr>
+      <w:tr>
+        <w:tc>
+          <w:tcPr>
+            <w:tcW w:type="dxa" w:w="4160"/>
+            <w:tcBorders>
+              <w:top w:val="single" w:color="BFBFBF" w:sz="4"/>
+              <w:left w:val="single" w:color="BFBFBF" w:sz="4"/>
+              <w:bottom w:val="single" w:color="BFBFBF" w:sz="4"/>
+              <w:right w:val="single" w:color="BFBFBF" w:sz="4"/>
+            </w:tcBorders>
+            <w:tcMar>
+              <w:top w:type="dxa" w:w="60"/>
+              <w:left w:type="dxa" w:w="100"/>
+              <w:bottom w:type="dxa" w:w="60"/>
+              <w:right w:type="dxa" w:w="100"/>
+            </w:tcMar>
+            <w:vAlign w:val="center"/>
+          </w:tcPr>
+          <w:p>
+            <w:pPr>
+              <w:jc w:val="left"/>
+            </w:pPr>
+            <w:r>
+              <w:rPr>
+                <w:sz w:val="19"/>
+                <w:szCs w:val="19"/>
+              </w:rPr>
+              <w:t xml:space="preserve">3-D RMS X/Y/Z (mm)</w:t>
+            </w:r>
+          </w:p>
+        </w:tc>
+        <w:tc>
+          <w:tcPr>
+            <w:tcW w:type="dxa" w:w="5200"/>
+            <w:tcBorders>
+              <w:top w:val="single" w:color="BFBFBF" w:sz="4"/>
+              <w:left w:val="single" w:color="BFBFBF" w:sz="4"/>
+              <w:bottom w:val="single" w:color="BFBFBF" w:sz="4"/>
+              <w:right w:val="single" w:color="BFBFBF" w:sz="4"/>
+            </w:tcBorders>
+            <w:tcMar>
+              <w:top w:type="dxa" w:w="60"/>
+              <w:left w:type="dxa" w:w="100"/>
+              <w:bottom w:type="dxa" w:w="60"/>
+              <w:right w:type="dxa" w:w="100"/>
+            </w:tcMar>
+            <w:vAlign w:val="center"/>
+          </w:tcPr>
+          <w:p>
+            <w:pPr>
+              <w:jc w:val="left"/>
+            </w:pPr>
+            <w:r>
+              <w:rPr>
+                <w:sz w:val="19"/>
+                <w:szCs w:val="19"/>
+              </w:rPr>
+              <w:t xml:space="preserve">[91.9, 268.9, 89.0]</w:t>
+            </w:r>
+          </w:p>
+        </w:tc>
+      </w:tr>
+      <w:tr>
+        <w:tc>
+          <w:tcPr>
+            <w:tcW w:type="dxa" w:w="4160"/>
+            <w:tcBorders>
+              <w:top w:val="single" w:color="BFBFBF" w:sz="4"/>
+              <w:left w:val="single" w:color="BFBFBF" w:sz="4"/>
+              <w:bottom w:val="single" w:color="BFBFBF" w:sz="4"/>
+              <w:right w:val="single" w:color="BFBFBF" w:sz="4"/>
+            </w:tcBorders>
+            <w:tcMar>
+              <w:top w:type="dxa" w:w="60"/>
+              <w:left w:type="dxa" w:w="100"/>
+              <w:bottom w:type="dxa" w:w="60"/>
+              <w:right w:type="dxa" w:w="100"/>
+            </w:tcMar>
+            <w:vAlign w:val="center"/>
+          </w:tcPr>
+          <w:p>
+            <w:pPr>
+              <w:jc w:val="left"/>
+            </w:pPr>
+            <w:r>
+              <w:rPr>
+                <w:sz w:val="19"/>
+                <w:szCs w:val="19"/>
+              </w:rPr>
+              <w:t xml:space="preserve">Signed bias X/Y/Z (mm)</w:t>
+            </w:r>
+          </w:p>
+        </w:tc>
+        <w:tc>
+          <w:tcPr>
+            <w:tcW w:type="dxa" w:w="5200"/>
+            <w:tcBorders>
+              <w:top w:val="single" w:color="BFBFBF" w:sz="4"/>
+              <w:left w:val="single" w:color="BFBFBF" w:sz="4"/>
+              <w:bottom w:val="single" w:color="BFBFBF" w:sz="4"/>
+              <w:right w:val="single" w:color="BFBFBF" w:sz="4"/>
+            </w:tcBorders>
+            <w:tcMar>
+              <w:top w:type="dxa" w:w="60"/>
+              <w:left w:type="dxa" w:w="100"/>
+              <w:bottom w:type="dxa" w:w="60"/>
+              <w:right w:type="dxa" w:w="100"/>
+            </w:tcMar>
+            <w:vAlign w:val="center"/>
+          </w:tcPr>
+          <w:p>
+            <w:pPr>
+              <w:jc w:val="left"/>
+            </w:pPr>
+            <w:r>
+              <w:rPr>
+                <w:sz w:val="19"/>
+                <w:szCs w:val="19"/>
+              </w:rPr>
+              <w:t xml:space="preserve">[−1, −48, −6]</w:t>
+            </w:r>
+          </w:p>
+        </w:tc>
+      </w:tr>
+      <w:tr>
+        <w:tc>
+          <w:tcPr>
+            <w:tcW w:type="dxa" w:w="4160"/>
+            <w:tcBorders>
+              <w:top w:val="single" w:color="BFBFBF" w:sz="4"/>
+              <w:left w:val="single" w:color="BFBFBF" w:sz="4"/>
+              <w:bottom w:val="single" w:color="BFBFBF" w:sz="4"/>
+              <w:right w:val="single" w:color="BFBFBF" w:sz="4"/>
+            </w:tcBorders>
+            <w:tcMar>
+              <w:top w:type="dxa" w:w="60"/>
+              <w:left w:type="dxa" w:w="100"/>
+              <w:bottom w:type="dxa" w:w="60"/>
+              <w:right w:type="dxa" w:w="100"/>
+            </w:tcMar>
+            <w:vAlign w:val="center"/>
+          </w:tcPr>
+          <w:p>
+            <w:pPr>
+              <w:jc w:val="left"/>
+            </w:pPr>
+            <w:r>
+              <w:rPr>
+                <w:sz w:val="19"/>
+                <w:szCs w:val="19"/>
+              </w:rPr>
+              <w:t xml:space="preserve">Residual / LOO / cond</w:t>
+            </w:r>
+          </w:p>
+        </w:tc>
+        <w:tc>
+          <w:tcPr>
+            <w:tcW w:type="dxa" w:w="5200"/>
+            <w:tcBorders>
+              <w:top w:val="single" w:color="BFBFBF" w:sz="4"/>
+              <w:left w:val="single" w:color="BFBFBF" w:sz="4"/>
+              <w:bottom w:val="single" w:color="BFBFBF" w:sz="4"/>
+              <w:right w:val="single" w:color="BFBFBF" w:sz="4"/>
+            </w:tcBorders>
+            <w:tcMar>
+              <w:top w:type="dxa" w:w="60"/>
+              <w:left w:type="dxa" w:w="100"/>
+              <w:bottom w:type="dxa" w:w="60"/>
+              <w:right w:type="dxa" w:w="100"/>
+            </w:tcMar>
+            <w:vAlign w:val="center"/>
+          </w:tcPr>
+          <w:p>
+            <w:pPr>
+              <w:jc w:val="left"/>
+            </w:pPr>
+            <w:r>
+              <w:rPr>
+                <w:sz w:val="19"/>
+                <w:szCs w:val="19"/>
+              </w:rPr>
+              <w:t xml:space="preserve">1.03σ / 1.09σ / 2.2</w:t>
+            </w:r>
+          </w:p>
+        </w:tc>
+      </w:tr>
+      <w:tr>
+        <w:tc>
+          <w:tcPr>
+            <w:tcW w:type="dxa" w:w="4160"/>
+            <w:tcBorders>
+              <w:top w:val="single" w:color="BFBFBF" w:sz="4"/>
+              <w:left w:val="single" w:color="BFBFBF" w:sz="4"/>
+              <w:bottom w:val="single" w:color="BFBFBF" w:sz="4"/>
+              <w:right w:val="single" w:color="BFBFBF" w:sz="4"/>
+            </w:tcBorders>
+            <w:tcMar>
+              <w:top w:type="dxa" w:w="60"/>
+              <w:left w:type="dxa" w:w="100"/>
+              <w:bottom w:type="dxa" w:w="60"/>
+              <w:right w:type="dxa" w:w="100"/>
+            </w:tcMar>
+            <w:vAlign w:val="center"/>
+          </w:tcPr>
+          <w:p>
+            <w:pPr>
+              <w:jc w:val="left"/>
+            </w:pPr>
+            <w:r>
+              <w:rPr>
+                <w:sz w:val="19"/>
+                <w:szCs w:val="19"/>
+              </w:rPr>
+              <w:t xml:space="preserve">Verdict</w:t>
+            </w:r>
+          </w:p>
+        </w:tc>
+        <w:tc>
+          <w:tcPr>
+            <w:tcW w:type="dxa" w:w="5200"/>
+            <w:tcBorders>
+              <w:top w:val="single" w:color="BFBFBF" w:sz="4"/>
+              <w:left w:val="single" w:color="BFBFBF" w:sz="4"/>
+              <w:bottom w:val="single" w:color="BFBFBF" w:sz="4"/>
+              <w:right w:val="single" w:color="BFBFBF" w:sz="4"/>
+            </w:tcBorders>
+            <w:tcMar>
+              <w:top w:type="dxa" w:w="60"/>
+              <w:left w:type="dxa" w:w="100"/>
+              <w:bottom w:type="dxa" w:w="60"/>
+              <w:right w:type="dxa" w:w="100"/>
+            </w:tcMar>
+            <w:vAlign w:val="center"/>
+          </w:tcPr>
+          <w:p>
+            <w:pPr>
+              <w:jc w:val="left"/>
+            </w:pPr>
+            <w:r>
+              <w:rPr>
+                <w:sz w:val="19"/>
+                <w:szCs w:val="19"/>
+              </w:rPr>
+              <w:t xml:space="preserve">SUSPECT on RMS — the fails are the radar's weak-elevation Y axis; rotation, horizontal cross-range, and range are good</w:t>
+            </w:r>
+          </w:p>
+        </w:tc>
+      </w:tr>
+    </w:tbl>
+    <w:p>
+      <w:pPr>
+        <w:spacing w:after="120"/>
+      </w:pPr>
+    </w:p>
+    <w:p>
+      <w:pPr>
+        <w:spacing w:after="200"/>
+      </w:pPr>
+      <w:r>
+        <w:rPr>
+          <w:i/>
+          <w:iCs/>
+          <w:color w:val="555555"/>
+          <w:sz w:val="20"/>
+          <w:szCs w:val="20"/>
+        </w:rPr>
+        <w:t xml:space="preserve">Offline cross-check (solve_from_poses.py, no ROS) on this 31-pose set: the measurement-space ML solver reproduces the live node to 0.95° / 32 mm. A plain isotropic Kabsch re-solve on the same data landed 16.6° / 391 mm away — a live demonstration of the bias described in Section 4.1.</w:t>
+      </w:r>
+    </w:p>
+    <w:p>
+      <w:pPr>
+        <w:pStyle w:val="Heading2"/>
+        <w:spacing w:after="140" w:before="280"/>
+      </w:pPr>
+      <w:r>
+        <w:t xml:space="preserve">5.2 ZED ↔ Radar2</w:t>
+      </w:r>
+    </w:p>
+    <w:p>
+      <w:pPr>
+        <w:spacing w:after="160"/>
+      </w:pPr>
+      <w:r>
+        <w:t xml:space="preserve">Mount: rolled ~87–90° clockwise about boresight vs. radar1 (top points RIGHT) — an intentional orthogonal mount so its weak angular axis is perpendicular to radar1's.</w:t>
+      </w:r>
+    </w:p>
+    <w:p>
+      <w:pPr>
+        <w:spacing w:after="160"/>
+      </w:pPr>
+      <w:r>
+        <w:t xml:space="preserve">Final result — standardized protocol, 2026-07-22 (deployable):</w:t>
+      </w:r>
+    </w:p>
+    <w:tbl>
+      <w:tblPr>
+        <w:tblW w:type="dxa" w:w="9360"/>
+        <w:tblBorders>
+          <w:top w:val="single" w:color="auto" w:sz="4"/>
+          <w:left w:val="single" w:color="auto" w:sz="4"/>
+          <w:bottom w:val="single" w:color="auto" w:sz="4"/>
+          <w:right w:val="single" w:color="auto" w:sz="4"/>
+          <w:insideH w:val="single" w:color="auto" w:sz="4"/>
+          <w:insideV w:val="single" w:color="auto" w:sz="4"/>
+        </w:tblBorders>
+      </w:tblPr>
+      <w:tblGrid>
+        <w:gridCol w:w="4160"/>
+        <w:gridCol w:w="5200"/>
+      </w:tblGrid>
+      <w:tr>
+        <w:tc>
+          <w:tcPr>
+            <w:tcW w:type="dxa" w:w="4160"/>
+            <w:tcBorders>
+              <w:top w:val="single" w:color="BFBFBF" w:sz="4"/>
+              <w:left w:val="single" w:color="BFBFBF" w:sz="4"/>
+              <w:bottom w:val="single" w:color="BFBFBF" w:sz="4"/>
+              <w:right w:val="single" w:color="BFBFBF" w:sz="4"/>
+            </w:tcBorders>
+            <w:shd w:fill="2F5496" w:val="clear"/>
+            <w:tcMar>
+              <w:top w:type="dxa" w:w="60"/>
+              <w:left w:type="dxa" w:w="100"/>
+              <w:bottom w:type="dxa" w:w="60"/>
+              <w:right w:type="dxa" w:w="100"/>
+            </w:tcMar>
+            <w:vAlign w:val="center"/>
+          </w:tcPr>
+          <w:p>
+            <w:pPr>
+              <w:jc w:val="left"/>
+            </w:pPr>
+            <w:r>
+              <w:rPr>
+                <w:b/>
+                <w:bCs/>
+                <w:color w:val="FFFFFF"/>
+                <w:sz w:val="19"/>
+                <w:szCs w:val="19"/>
+              </w:rPr>
+              <w:t xml:space="preserve">Quantity</w:t>
+            </w:r>
+          </w:p>
+        </w:tc>
+        <w:tc>
+          <w:tcPr>
+            <w:tcW w:type="dxa" w:w="5200"/>
+            <w:tcBorders>
+              <w:top w:val="single" w:color="BFBFBF" w:sz="4"/>
+              <w:left w:val="single" w:color="BFBFBF" w:sz="4"/>
+              <w:bottom w:val="single" w:color="BFBFBF" w:sz="4"/>
+              <w:right w:val="single" w:color="BFBFBF" w:sz="4"/>
+            </w:tcBorders>
+            <w:shd w:fill="2F5496" w:val="clear"/>
+            <w:tcMar>
+              <w:top w:type="dxa" w:w="60"/>
+              <w:left w:type="dxa" w:w="100"/>
+              <w:bottom w:type="dxa" w:w="60"/>
+              <w:right w:type="dxa" w:w="100"/>
+            </w:tcMar>
+            <w:vAlign w:val="center"/>
+          </w:tcPr>
+          <w:p>
+            <w:pPr>
+              <w:jc w:val="left"/>
+            </w:pPr>
+            <w:r>
+              <w:rPr>
+                <w:b/>
+                <w:bCs/>
+                <w:color w:val="FFFFFF"/>
+                <w:sz w:val="19"/>
+                <w:szCs w:val="19"/>
+              </w:rPr>
+              <w:t xml:space="preserve">Value</w:t>
+            </w:r>
+          </w:p>
+        </w:tc>
+      </w:tr>
+      <w:tr>
+        <w:tc>
+          <w:tcPr>
+            <w:tcW w:type="dxa" w:w="4160"/>
+            <w:tcBorders>
+              <w:top w:val="single" w:color="BFBFBF" w:sz="4"/>
+              <w:left w:val="single" w:color="BFBFBF" w:sz="4"/>
+              <w:bottom w:val="single" w:color="BFBFBF" w:sz="4"/>
+              <w:right w:val="single" w:color="BFBFBF" w:sz="4"/>
+            </w:tcBorders>
+            <w:tcMar>
+              <w:top w:type="dxa" w:w="60"/>
+              <w:left w:type="dxa" w:w="100"/>
+              <w:bottom w:type="dxa" w:w="60"/>
+              <w:right w:type="dxa" w:w="100"/>
+            </w:tcMar>
+            <w:vAlign w:val="center"/>
+          </w:tcPr>
+          <w:p>
+            <w:pPr>
+              <w:jc w:val="left"/>
+            </w:pPr>
+            <w:r>
+              <w:rPr>
+                <w:sz w:val="19"/>
+                <w:szCs w:val="19"/>
+              </w:rPr>
               <w:t xml:space="preserve">Translation t (m)</w:t>
             </w:r>
           </w:p>
@@ -5486,6 +6926,1316 @@
                 <w:szCs w:val="19"/>
               </w:rPr>
               <w:t xml:space="preserve">horizontal (X) — the rolled-90° mount rotates its weak axis into horizontal</w:t>
+            </w:r>
+          </w:p>
+        </w:tc>
+      </w:tr>
+    </w:tbl>
+    <w:p>
+      <w:pPr>
+        <w:spacing w:after="120"/>
+      </w:pPr>
+    </w:p>
+    <w:p>
+      <w:pPr>
+        <w:spacing w:after="160"/>
+      </w:pPr>
+      <w:r>
+        <w:t xml:space="preserve">Earlier validation result — 2026-07-15, final of 3 convergence rounds, 30 poses (superseded by the 2026-07-22 result above, shown for the record):</w:t>
+      </w:r>
+    </w:p>
+    <w:tbl>
+      <w:tblPr>
+        <w:tblW w:type="dxa" w:w="9360"/>
+        <w:tblBorders>
+          <w:top w:val="single" w:color="auto" w:sz="4"/>
+          <w:left w:val="single" w:color="auto" w:sz="4"/>
+          <w:bottom w:val="single" w:color="auto" w:sz="4"/>
+          <w:right w:val="single" w:color="auto" w:sz="4"/>
+          <w:insideH w:val="single" w:color="auto" w:sz="4"/>
+          <w:insideV w:val="single" w:color="auto" w:sz="4"/>
+        </w:tblBorders>
+      </w:tblPr>
+      <w:tblGrid>
+        <w:gridCol w:w="4160"/>
+        <w:gridCol w:w="5200"/>
+      </w:tblGrid>
+      <w:tr>
+        <w:tc>
+          <w:tcPr>
+            <w:tcW w:type="dxa" w:w="4160"/>
+            <w:tcBorders>
+              <w:top w:val="single" w:color="BFBFBF" w:sz="4"/>
+              <w:left w:val="single" w:color="BFBFBF" w:sz="4"/>
+              <w:bottom w:val="single" w:color="BFBFBF" w:sz="4"/>
+              <w:right w:val="single" w:color="BFBFBF" w:sz="4"/>
+            </w:tcBorders>
+            <w:shd w:fill="2F5496" w:val="clear"/>
+            <w:tcMar>
+              <w:top w:type="dxa" w:w="60"/>
+              <w:left w:type="dxa" w:w="100"/>
+              <w:bottom w:type="dxa" w:w="60"/>
+              <w:right w:type="dxa" w:w="100"/>
+            </w:tcMar>
+            <w:vAlign w:val="center"/>
+          </w:tcPr>
+          <w:p>
+            <w:pPr>
+              <w:jc w:val="left"/>
+            </w:pPr>
+            <w:r>
+              <w:rPr>
+                <w:b/>
+                <w:bCs/>
+                <w:color w:val="FFFFFF"/>
+                <w:sz w:val="19"/>
+                <w:szCs w:val="19"/>
+              </w:rPr>
+              <w:t xml:space="preserve">Quantity</w:t>
+            </w:r>
+          </w:p>
+        </w:tc>
+        <w:tc>
+          <w:tcPr>
+            <w:tcW w:type="dxa" w:w="5200"/>
+            <w:tcBorders>
+              <w:top w:val="single" w:color="BFBFBF" w:sz="4"/>
+              <w:left w:val="single" w:color="BFBFBF" w:sz="4"/>
+              <w:bottom w:val="single" w:color="BFBFBF" w:sz="4"/>
+              <w:right w:val="single" w:color="BFBFBF" w:sz="4"/>
+            </w:tcBorders>
+            <w:shd w:fill="2F5496" w:val="clear"/>
+            <w:tcMar>
+              <w:top w:type="dxa" w:w="60"/>
+              <w:left w:type="dxa" w:w="100"/>
+              <w:bottom w:type="dxa" w:w="60"/>
+              <w:right w:type="dxa" w:w="100"/>
+            </w:tcMar>
+            <w:vAlign w:val="center"/>
+          </w:tcPr>
+          <w:p>
+            <w:pPr>
+              <w:jc w:val="left"/>
+            </w:pPr>
+            <w:r>
+              <w:rPr>
+                <w:b/>
+                <w:bCs/>
+                <w:color w:val="FFFFFF"/>
+                <w:sz w:val="19"/>
+                <w:szCs w:val="19"/>
+              </w:rPr>
+              <w:t xml:space="preserve">Value</w:t>
+            </w:r>
+          </w:p>
+        </w:tc>
+      </w:tr>
+      <w:tr>
+        <w:tc>
+          <w:tcPr>
+            <w:tcW w:type="dxa" w:w="4160"/>
+            <w:tcBorders>
+              <w:top w:val="single" w:color="BFBFBF" w:sz="4"/>
+              <w:left w:val="single" w:color="BFBFBF" w:sz="4"/>
+              <w:bottom w:val="single" w:color="BFBFBF" w:sz="4"/>
+              <w:right w:val="single" w:color="BFBFBF" w:sz="4"/>
+            </w:tcBorders>
+            <w:tcMar>
+              <w:top w:type="dxa" w:w="60"/>
+              <w:left w:type="dxa" w:w="100"/>
+              <w:bottom w:type="dxa" w:w="60"/>
+              <w:right w:type="dxa" w:w="100"/>
+            </w:tcMar>
+            <w:vAlign w:val="center"/>
+          </w:tcPr>
+          <w:p>
+            <w:pPr>
+              <w:jc w:val="left"/>
+            </w:pPr>
+            <w:r>
+              <w:rPr>
+                <w:sz w:val="19"/>
+                <w:szCs w:val="19"/>
+              </w:rPr>
+              <w:t xml:space="preserve">Translation t (m)</w:t>
+            </w:r>
+          </w:p>
+        </w:tc>
+        <w:tc>
+          <w:tcPr>
+            <w:tcW w:type="dxa" w:w="5200"/>
+            <w:tcBorders>
+              <w:top w:val="single" w:color="BFBFBF" w:sz="4"/>
+              <w:left w:val="single" w:color="BFBFBF" w:sz="4"/>
+              <w:bottom w:val="single" w:color="BFBFBF" w:sz="4"/>
+              <w:right w:val="single" w:color="BFBFBF" w:sz="4"/>
+            </w:tcBorders>
+            <w:tcMar>
+              <w:top w:type="dxa" w:w="60"/>
+              <w:left w:type="dxa" w:w="100"/>
+              <w:bottom w:type="dxa" w:w="60"/>
+              <w:right w:type="dxa" w:w="100"/>
+            </w:tcMar>
+            <w:vAlign w:val="center"/>
+          </w:tcPr>
+          <w:p>
+            <w:pPr>
+              <w:jc w:val="left"/>
+            </w:pPr>
+            <w:r>
+              <w:rPr>
+                <w:sz w:val="19"/>
+                <w:szCs w:val="19"/>
+              </w:rPr>
+              <w:t xml:space="preserve">[−0.0999, −0.0124, −0.0011]   (|t| = 10.1 cm)</w:t>
+            </w:r>
+          </w:p>
+        </w:tc>
+      </w:tr>
+      <w:tr>
+        <w:tc>
+          <w:tcPr>
+            <w:tcW w:type="dxa" w:w="4160"/>
+            <w:tcBorders>
+              <w:top w:val="single" w:color="BFBFBF" w:sz="4"/>
+              <w:left w:val="single" w:color="BFBFBF" w:sz="4"/>
+              <w:bottom w:val="single" w:color="BFBFBF" w:sz="4"/>
+              <w:right w:val="single" w:color="BFBFBF" w:sz="4"/>
+            </w:tcBorders>
+            <w:tcMar>
+              <w:top w:type="dxa" w:w="60"/>
+              <w:left w:type="dxa" w:w="100"/>
+              <w:bottom w:type="dxa" w:w="60"/>
+              <w:right w:type="dxa" w:w="100"/>
+            </w:tcMar>
+            <w:vAlign w:val="center"/>
+          </w:tcPr>
+          <w:p>
+            <w:pPr>
+              <w:jc w:val="left"/>
+            </w:pPr>
+            <w:r>
+              <w:rPr>
+                <w:sz w:val="19"/>
+                <w:szCs w:val="19"/>
+              </w:rPr>
+              <w:t xml:space="preserve">Quaternion (xyzw)</w:t>
+            </w:r>
+          </w:p>
+        </w:tc>
+        <w:tc>
+          <w:tcPr>
+            <w:tcW w:type="dxa" w:w="5200"/>
+            <w:tcBorders>
+              <w:top w:val="single" w:color="BFBFBF" w:sz="4"/>
+              <w:left w:val="single" w:color="BFBFBF" w:sz="4"/>
+              <w:bottom w:val="single" w:color="BFBFBF" w:sz="4"/>
+              <w:right w:val="single" w:color="BFBFBF" w:sz="4"/>
+            </w:tcBorders>
+            <w:tcMar>
+              <w:top w:type="dxa" w:w="60"/>
+              <w:left w:type="dxa" w:w="100"/>
+              <w:bottom w:type="dxa" w:w="60"/>
+              <w:right w:type="dxa" w:w="100"/>
+            </w:tcMar>
+            <w:vAlign w:val="center"/>
+          </w:tcPr>
+          <w:p>
+            <w:pPr>
+              <w:jc w:val="left"/>
+            </w:pPr>
+            <w:r>
+              <w:rPr>
+                <w:sz w:val="19"/>
+                <w:szCs w:val="19"/>
+              </w:rPr>
+              <w:t xml:space="preserve">[+0.7882, −0.0406, +0.6121, +0.0499]</w:t>
+            </w:r>
+          </w:p>
+        </w:tc>
+      </w:tr>
+      <w:tr>
+        <w:tc>
+          <w:tcPr>
+            <w:tcW w:type="dxa" w:w="4160"/>
+            <w:tcBorders>
+              <w:top w:val="single" w:color="BFBFBF" w:sz="4"/>
+              <w:left w:val="single" w:color="BFBFBF" w:sz="4"/>
+              <w:bottom w:val="single" w:color="BFBFBF" w:sz="4"/>
+              <w:right w:val="single" w:color="BFBFBF" w:sz="4"/>
+            </w:tcBorders>
+            <w:tcMar>
+              <w:top w:type="dxa" w:w="60"/>
+              <w:left w:type="dxa" w:w="100"/>
+              <w:bottom w:type="dxa" w:w="60"/>
+              <w:right w:type="dxa" w:w="100"/>
+            </w:tcMar>
+            <w:vAlign w:val="center"/>
+          </w:tcPr>
+          <w:p>
+            <w:pPr>
+              <w:jc w:val="left"/>
+            </w:pPr>
+            <w:r>
+              <w:rPr>
+                <w:sz w:val="19"/>
+                <w:szCs w:val="19"/>
+              </w:rPr>
+              <w:t xml:space="preserve">radar_range_scale</w:t>
+            </w:r>
+          </w:p>
+        </w:tc>
+        <w:tc>
+          <w:tcPr>
+            <w:tcW w:type="dxa" w:w="5200"/>
+            <w:tcBorders>
+              <w:top w:val="single" w:color="BFBFBF" w:sz="4"/>
+              <w:left w:val="single" w:color="BFBFBF" w:sz="4"/>
+              <w:bottom w:val="single" w:color="BFBFBF" w:sz="4"/>
+              <w:right w:val="single" w:color="BFBFBF" w:sz="4"/>
+            </w:tcBorders>
+            <w:tcMar>
+              <w:top w:type="dxa" w:w="60"/>
+              <w:left w:type="dxa" w:w="100"/>
+              <w:bottom w:type="dxa" w:w="60"/>
+              <w:right w:type="dxa" w:w="100"/>
+            </w:tcMar>
+            <w:vAlign w:val="center"/>
+          </w:tcPr>
+          <w:p>
+            <w:pPr>
+              <w:jc w:val="left"/>
+            </w:pPr>
+            <w:r>
+              <w:rPr>
+                <w:sz w:val="19"/>
+                <w:szCs w:val="19"/>
+              </w:rPr>
+              <w:t xml:space="preserve">1.026</w:t>
+            </w:r>
+          </w:p>
+        </w:tc>
+      </w:tr>
+      <w:tr>
+        <w:tc>
+          <w:tcPr>
+            <w:tcW w:type="dxa" w:w="4160"/>
+            <w:tcBorders>
+              <w:top w:val="single" w:color="BFBFBF" w:sz="4"/>
+              <w:left w:val="single" w:color="BFBFBF" w:sz="4"/>
+              <w:bottom w:val="single" w:color="BFBFBF" w:sz="4"/>
+              <w:right w:val="single" w:color="BFBFBF" w:sz="4"/>
+            </w:tcBorders>
+            <w:tcMar>
+              <w:top w:type="dxa" w:w="60"/>
+              <w:left w:type="dxa" w:w="100"/>
+              <w:bottom w:type="dxa" w:w="60"/>
+              <w:right w:type="dxa" w:w="100"/>
+            </w:tcMar>
+            <w:vAlign w:val="center"/>
+          </w:tcPr>
+          <w:p>
+            <w:pPr>
+              <w:jc w:val="left"/>
+            </w:pPr>
+            <w:r>
+              <w:rPr>
+                <w:sz w:val="19"/>
+                <w:szCs w:val="19"/>
+              </w:rPr>
+              <w:t xml:space="preserve">Rotation 1σ (deg)</w:t>
+            </w:r>
+          </w:p>
+        </w:tc>
+        <w:tc>
+          <w:tcPr>
+            <w:tcW w:type="dxa" w:w="5200"/>
+            <w:tcBorders>
+              <w:top w:val="single" w:color="BFBFBF" w:sz="4"/>
+              <w:left w:val="single" w:color="BFBFBF" w:sz="4"/>
+              <w:bottom w:val="single" w:color="BFBFBF" w:sz="4"/>
+              <w:right w:val="single" w:color="BFBFBF" w:sz="4"/>
+            </w:tcBorders>
+            <w:tcMar>
+              <w:top w:type="dxa" w:w="60"/>
+              <w:left w:type="dxa" w:w="100"/>
+              <w:bottom w:type="dxa" w:w="60"/>
+              <w:right w:type="dxa" w:w="100"/>
+            </w:tcMar>
+            <w:vAlign w:val="center"/>
+          </w:tcPr>
+          <w:p>
+            <w:pPr>
+              <w:jc w:val="left"/>
+            </w:pPr>
+            <w:r>
+              <w:rPr>
+                <w:sz w:val="19"/>
+                <w:szCs w:val="19"/>
+              </w:rPr>
+              <w:t xml:space="preserve">[2.64, 5.18, 4.00]</w:t>
+            </w:r>
+          </w:p>
+        </w:tc>
+      </w:tr>
+      <w:tr>
+        <w:tc>
+          <w:tcPr>
+            <w:tcW w:type="dxa" w:w="4160"/>
+            <w:tcBorders>
+              <w:top w:val="single" w:color="BFBFBF" w:sz="4"/>
+              <w:left w:val="single" w:color="BFBFBF" w:sz="4"/>
+              <w:bottom w:val="single" w:color="BFBFBF" w:sz="4"/>
+              <w:right w:val="single" w:color="BFBFBF" w:sz="4"/>
+            </w:tcBorders>
+            <w:tcMar>
+              <w:top w:type="dxa" w:w="60"/>
+              <w:left w:type="dxa" w:w="100"/>
+              <w:bottom w:type="dxa" w:w="60"/>
+              <w:right w:type="dxa" w:w="100"/>
+            </w:tcMar>
+            <w:vAlign w:val="center"/>
+          </w:tcPr>
+          <w:p>
+            <w:pPr>
+              <w:jc w:val="left"/>
+            </w:pPr>
+            <w:r>
+              <w:rPr>
+                <w:sz w:val="19"/>
+                <w:szCs w:val="19"/>
+              </w:rPr>
+              <w:t xml:space="preserve">Translation 1σ (mm)</w:t>
+            </w:r>
+          </w:p>
+        </w:tc>
+        <w:tc>
+          <w:tcPr>
+            <w:tcW w:type="dxa" w:w="5200"/>
+            <w:tcBorders>
+              <w:top w:val="single" w:color="BFBFBF" w:sz="4"/>
+              <w:left w:val="single" w:color="BFBFBF" w:sz="4"/>
+              <w:bottom w:val="single" w:color="BFBFBF" w:sz="4"/>
+              <w:right w:val="single" w:color="BFBFBF" w:sz="4"/>
+            </w:tcBorders>
+            <w:tcMar>
+              <w:top w:type="dxa" w:w="60"/>
+              <w:left w:type="dxa" w:w="100"/>
+              <w:bottom w:type="dxa" w:w="60"/>
+              <w:right w:type="dxa" w:w="100"/>
+            </w:tcMar>
+            <w:vAlign w:val="center"/>
+          </w:tcPr>
+          <w:p>
+            <w:pPr>
+              <w:jc w:val="left"/>
+            </w:pPr>
+            <w:r>
+              <w:rPr>
+                <w:sz w:val="19"/>
+                <w:szCs w:val="19"/>
+              </w:rPr>
+              <w:t xml:space="preserve">[31.8, 28.8, 30.7]</w:t>
+            </w:r>
+          </w:p>
+        </w:tc>
+      </w:tr>
+      <w:tr>
+        <w:tc>
+          <w:tcPr>
+            <w:tcW w:type="dxa" w:w="4160"/>
+            <w:tcBorders>
+              <w:top w:val="single" w:color="BFBFBF" w:sz="4"/>
+              <w:left w:val="single" w:color="BFBFBF" w:sz="4"/>
+              <w:bottom w:val="single" w:color="BFBFBF" w:sz="4"/>
+              <w:right w:val="single" w:color="BFBFBF" w:sz="4"/>
+            </w:tcBorders>
+            <w:tcMar>
+              <w:top w:type="dxa" w:w="60"/>
+              <w:left w:type="dxa" w:w="100"/>
+              <w:bottom w:type="dxa" w:w="60"/>
+              <w:right w:type="dxa" w:w="100"/>
+            </w:tcMar>
+            <w:vAlign w:val="center"/>
+          </w:tcPr>
+          <w:p>
+            <w:pPr>
+              <w:jc w:val="left"/>
+            </w:pPr>
+            <w:r>
+              <w:rPr>
+                <w:sz w:val="19"/>
+                <w:szCs w:val="19"/>
+              </w:rPr>
+              <w:t xml:space="preserve">Apex offset (m)</w:t>
+            </w:r>
+          </w:p>
+        </w:tc>
+        <w:tc>
+          <w:tcPr>
+            <w:tcW w:type="dxa" w:w="5200"/>
+            <w:tcBorders>
+              <w:top w:val="single" w:color="BFBFBF" w:sz="4"/>
+              <w:left w:val="single" w:color="BFBFBF" w:sz="4"/>
+              <w:bottom w:val="single" w:color="BFBFBF" w:sz="4"/>
+              <w:right w:val="single" w:color="BFBFBF" w:sz="4"/>
+            </w:tcBorders>
+            <w:tcMar>
+              <w:top w:type="dxa" w:w="60"/>
+              <w:left w:type="dxa" w:w="100"/>
+              <w:bottom w:type="dxa" w:w="60"/>
+              <w:right w:type="dxa" w:w="100"/>
+            </w:tcMar>
+            <w:vAlign w:val="center"/>
+          </w:tcPr>
+          <w:p>
+            <w:pPr>
+              <w:jc w:val="left"/>
+            </w:pPr>
+            <w:r>
+              <w:rPr>
+                <w:sz w:val="19"/>
+                <w:szCs w:val="19"/>
+              </w:rPr>
+              <w:t xml:space="preserve">[+0.280, +0.648, −0.166], 1σ [27, 23, 32] mm — Z weakly observed</w:t>
+            </w:r>
+          </w:p>
+        </w:tc>
+      </w:tr>
+      <w:tr>
+        <w:tc>
+          <w:tcPr>
+            <w:tcW w:type="dxa" w:w="4160"/>
+            <w:tcBorders>
+              <w:top w:val="single" w:color="BFBFBF" w:sz="4"/>
+              <w:left w:val="single" w:color="BFBFBF" w:sz="4"/>
+              <w:bottom w:val="single" w:color="BFBFBF" w:sz="4"/>
+              <w:right w:val="single" w:color="BFBFBF" w:sz="4"/>
+            </w:tcBorders>
+            <w:tcMar>
+              <w:top w:type="dxa" w:w="60"/>
+              <w:left w:type="dxa" w:w="100"/>
+              <w:bottom w:type="dxa" w:w="60"/>
+              <w:right w:type="dxa" w:w="100"/>
+            </w:tcMar>
+            <w:vAlign w:val="center"/>
+          </w:tcPr>
+          <w:p>
+            <w:pPr>
+              <w:jc w:val="left"/>
+            </w:pPr>
+            <w:r>
+              <w:rPr>
+                <w:sz w:val="19"/>
+                <w:szCs w:val="19"/>
+              </w:rPr>
+              <w:t xml:space="preserve">3-D RMS X/Y/Z (mm)</w:t>
+            </w:r>
+          </w:p>
+        </w:tc>
+        <w:tc>
+          <w:tcPr>
+            <w:tcW w:type="dxa" w:w="5200"/>
+            <w:tcBorders>
+              <w:top w:val="single" w:color="BFBFBF" w:sz="4"/>
+              <w:left w:val="single" w:color="BFBFBF" w:sz="4"/>
+              <w:bottom w:val="single" w:color="BFBFBF" w:sz="4"/>
+              <w:right w:val="single" w:color="BFBFBF" w:sz="4"/>
+            </w:tcBorders>
+            <w:tcMar>
+              <w:top w:type="dxa" w:w="60"/>
+              <w:left w:type="dxa" w:w="100"/>
+              <w:bottom w:type="dxa" w:w="60"/>
+              <w:right w:type="dxa" w:w="100"/>
+            </w:tcMar>
+            <w:vAlign w:val="center"/>
+          </w:tcPr>
+          <w:p>
+            <w:pPr>
+              <w:jc w:val="left"/>
+            </w:pPr>
+            <w:r>
+              <w:rPr>
+                <w:sz w:val="19"/>
+                <w:szCs w:val="19"/>
+              </w:rPr>
+              <w:t xml:space="preserve">[215.3, 150.0, 73.9]</w:t>
+            </w:r>
+          </w:p>
+        </w:tc>
+      </w:tr>
+      <w:tr>
+        <w:tc>
+          <w:tcPr>
+            <w:tcW w:type="dxa" w:w="4160"/>
+            <w:tcBorders>
+              <w:top w:val="single" w:color="BFBFBF" w:sz="4"/>
+              <w:left w:val="single" w:color="BFBFBF" w:sz="4"/>
+              <w:bottom w:val="single" w:color="BFBFBF" w:sz="4"/>
+              <w:right w:val="single" w:color="BFBFBF" w:sz="4"/>
+            </w:tcBorders>
+            <w:tcMar>
+              <w:top w:type="dxa" w:w="60"/>
+              <w:left w:type="dxa" w:w="100"/>
+              <w:bottom w:type="dxa" w:w="60"/>
+              <w:right w:type="dxa" w:w="100"/>
+            </w:tcMar>
+            <w:vAlign w:val="center"/>
+          </w:tcPr>
+          <w:p>
+            <w:pPr>
+              <w:jc w:val="left"/>
+            </w:pPr>
+            <w:r>
+              <w:rPr>
+                <w:sz w:val="19"/>
+                <w:szCs w:val="19"/>
+              </w:rPr>
+              <w:t xml:space="preserve">Signed bias X/Y/Z (mm)</w:t>
+            </w:r>
+          </w:p>
+        </w:tc>
+        <w:tc>
+          <w:tcPr>
+            <w:tcW w:type="dxa" w:w="5200"/>
+            <w:tcBorders>
+              <w:top w:val="single" w:color="BFBFBF" w:sz="4"/>
+              <w:left w:val="single" w:color="BFBFBF" w:sz="4"/>
+              <w:bottom w:val="single" w:color="BFBFBF" w:sz="4"/>
+              <w:right w:val="single" w:color="BFBFBF" w:sz="4"/>
+            </w:tcBorders>
+            <w:tcMar>
+              <w:top w:type="dxa" w:w="60"/>
+              <w:left w:type="dxa" w:w="100"/>
+              <w:bottom w:type="dxa" w:w="60"/>
+              <w:right w:type="dxa" w:w="100"/>
+            </w:tcMar>
+            <w:vAlign w:val="center"/>
+          </w:tcPr>
+          <w:p>
+            <w:pPr>
+              <w:jc w:val="left"/>
+            </w:pPr>
+            <w:r>
+              <w:rPr>
+                <w:sz w:val="19"/>
+                <w:szCs w:val="19"/>
+              </w:rPr>
+              <w:t xml:space="preserve">[+0, +1, +1] — essentially zero systematic error</w:t>
+            </w:r>
+          </w:p>
+        </w:tc>
+      </w:tr>
+      <w:tr>
+        <w:tc>
+          <w:tcPr>
+            <w:tcW w:type="dxa" w:w="4160"/>
+            <w:tcBorders>
+              <w:top w:val="single" w:color="BFBFBF" w:sz="4"/>
+              <w:left w:val="single" w:color="BFBFBF" w:sz="4"/>
+              <w:bottom w:val="single" w:color="BFBFBF" w:sz="4"/>
+              <w:right w:val="single" w:color="BFBFBF" w:sz="4"/>
+            </w:tcBorders>
+            <w:tcMar>
+              <w:top w:type="dxa" w:w="60"/>
+              <w:left w:type="dxa" w:w="100"/>
+              <w:bottom w:type="dxa" w:w="60"/>
+              <w:right w:type="dxa" w:w="100"/>
+            </w:tcMar>
+            <w:vAlign w:val="center"/>
+          </w:tcPr>
+          <w:p>
+            <w:pPr>
+              <w:jc w:val="left"/>
+            </w:pPr>
+            <w:r>
+              <w:rPr>
+                <w:sz w:val="19"/>
+                <w:szCs w:val="19"/>
+              </w:rPr>
+              <w:t xml:space="preserve">Residual / LOO / cond</w:t>
+            </w:r>
+          </w:p>
+        </w:tc>
+        <w:tc>
+          <w:tcPr>
+            <w:tcW w:type="dxa" w:w="5200"/>
+            <w:tcBorders>
+              <w:top w:val="single" w:color="BFBFBF" w:sz="4"/>
+              <w:left w:val="single" w:color="BFBFBF" w:sz="4"/>
+              <w:bottom w:val="single" w:color="BFBFBF" w:sz="4"/>
+              <w:right w:val="single" w:color="BFBFBF" w:sz="4"/>
+            </w:tcBorders>
+            <w:tcMar>
+              <w:top w:type="dxa" w:w="60"/>
+              <w:left w:type="dxa" w:w="100"/>
+              <w:bottom w:type="dxa" w:w="60"/>
+              <w:right w:type="dxa" w:w="100"/>
+            </w:tcMar>
+            <w:vAlign w:val="center"/>
+          </w:tcPr>
+          <w:p>
+            <w:pPr>
+              <w:jc w:val="left"/>
+            </w:pPr>
+            <w:r>
+              <w:rPr>
+                <w:sz w:val="19"/>
+                <w:szCs w:val="19"/>
+              </w:rPr>
+              <w:t xml:space="preserve">1.25σ / 1.34σ / 4.7</w:t>
+            </w:r>
+          </w:p>
+        </w:tc>
+      </w:tr>
+      <w:tr>
+        <w:tc>
+          <w:tcPr>
+            <w:tcW w:type="dxa" w:w="4160"/>
+            <w:tcBorders>
+              <w:top w:val="single" w:color="BFBFBF" w:sz="4"/>
+              <w:left w:val="single" w:color="BFBFBF" w:sz="4"/>
+              <w:bottom w:val="single" w:color="BFBFBF" w:sz="4"/>
+              <w:right w:val="single" w:color="BFBFBF" w:sz="4"/>
+            </w:tcBorders>
+            <w:tcMar>
+              <w:top w:type="dxa" w:w="60"/>
+              <w:left w:type="dxa" w:w="100"/>
+              <w:bottom w:type="dxa" w:w="60"/>
+              <w:right w:type="dxa" w:w="100"/>
+            </w:tcMar>
+            <w:vAlign w:val="center"/>
+          </w:tcPr>
+          <w:p>
+            <w:pPr>
+              <w:jc w:val="left"/>
+            </w:pPr>
+            <w:r>
+              <w:rPr>
+                <w:sz w:val="19"/>
+                <w:szCs w:val="19"/>
+              </w:rPr>
+              <w:t xml:space="preserve">Range fit</w:t>
+            </w:r>
+          </w:p>
+        </w:tc>
+        <w:tc>
+          <w:tcPr>
+            <w:tcW w:type="dxa" w:w="5200"/>
+            <w:tcBorders>
+              <w:top w:val="single" w:color="BFBFBF" w:sz="4"/>
+              <w:left w:val="single" w:color="BFBFBF" w:sz="4"/>
+              <w:bottom w:val="single" w:color="BFBFBF" w:sz="4"/>
+              <w:right w:val="single" w:color="BFBFBF" w:sz="4"/>
+            </w:tcBorders>
+            <w:tcMar>
+              <w:top w:type="dxa" w:w="60"/>
+              <w:left w:type="dxa" w:w="100"/>
+              <w:bottom w:type="dxa" w:w="60"/>
+              <w:right w:type="dxa" w:w="100"/>
+            </w:tcMar>
+            <w:vAlign w:val="center"/>
+          </w:tcPr>
+          <w:p>
+            <w:pPr>
+              <w:jc w:val="left"/>
+            </w:pPr>
+            <w:r>
+              <w:rPr>
+                <w:sz w:val="19"/>
+                <w:szCs w:val="19"/>
+              </w:rPr>
+              <w:t xml:space="preserve">cam_r = 0.948·radar_r + 0.089 m</w:t>
+            </w:r>
+          </w:p>
+        </w:tc>
+      </w:tr>
+      <w:tr>
+        <w:tc>
+          <w:tcPr>
+            <w:tcW w:type="dxa" w:w="4160"/>
+            <w:tcBorders>
+              <w:top w:val="single" w:color="BFBFBF" w:sz="4"/>
+              <w:left w:val="single" w:color="BFBFBF" w:sz="4"/>
+              <w:bottom w:val="single" w:color="BFBFBF" w:sz="4"/>
+              <w:right w:val="single" w:color="BFBFBF" w:sz="4"/>
+            </w:tcBorders>
+            <w:tcMar>
+              <w:top w:type="dxa" w:w="60"/>
+              <w:left w:type="dxa" w:w="100"/>
+              <w:bottom w:type="dxa" w:w="60"/>
+              <w:right w:type="dxa" w:w="100"/>
+            </w:tcMar>
+            <w:vAlign w:val="center"/>
+          </w:tcPr>
+          <w:p>
+            <w:pPr>
+              <w:jc w:val="left"/>
+            </w:pPr>
+            <w:r>
+              <w:rPr>
+                <w:sz w:val="19"/>
+                <w:szCs w:val="19"/>
+              </w:rPr>
+              <w:t xml:space="preserve">Verdict</w:t>
+            </w:r>
+          </w:p>
+        </w:tc>
+        <w:tc>
+          <w:tcPr>
+            <w:tcW w:type="dxa" w:w="5200"/>
+            <w:tcBorders>
+              <w:top w:val="single" w:color="BFBFBF" w:sz="4"/>
+              <w:left w:val="single" w:color="BFBFBF" w:sz="4"/>
+              <w:bottom w:val="single" w:color="BFBFBF" w:sz="4"/>
+              <w:right w:val="single" w:color="BFBFBF" w:sz="4"/>
+            </w:tcBorders>
+            <w:tcMar>
+              <w:top w:type="dxa" w:w="60"/>
+              <w:left w:type="dxa" w:w="100"/>
+              <w:bottom w:type="dxa" w:w="60"/>
+              <w:right w:type="dxa" w:w="100"/>
+            </w:tcMar>
+            <w:vAlign w:val="center"/>
+          </w:tcPr>
+          <w:p>
+            <w:pPr>
+              <w:jc w:val="left"/>
+            </w:pPr>
+            <w:r>
+              <w:rPr>
+                <w:sz w:val="19"/>
+                <w:szCs w:val="19"/>
+              </w:rPr>
+              <w:t xml:space="preserve">SUSPECT on RMS/reproj (random cross-range noise on its soft axis); systematic bias ~1 mm, extrinsic sound</w:t>
+            </w:r>
+          </w:p>
+        </w:tc>
+      </w:tr>
+    </w:tbl>
+    <w:p>
+      <w:pPr>
+        <w:spacing w:after="120"/>
+      </w:pPr>
+    </w:p>
+    <w:tbl>
+      <w:tblPr>
+        <w:tblW w:type="dxa" w:w="9360"/>
+        <w:tblBorders>
+          <w:top w:val="single" w:color="auto" w:sz="4"/>
+          <w:left w:val="single" w:color="auto" w:sz="4"/>
+          <w:bottom w:val="single" w:color="auto" w:sz="4"/>
+          <w:right w:val="single" w:color="auto" w:sz="4"/>
+          <w:insideH w:val="single" w:color="auto" w:sz="4"/>
+          <w:insideV w:val="single" w:color="auto" w:sz="4"/>
+        </w:tblBorders>
+      </w:tblPr>
+      <w:tblGrid>
+        <w:gridCol w:w="1991"/>
+        <w:gridCol w:w="1394"/>
+        <w:gridCol w:w="1593"/>
+        <w:gridCol w:w="4381"/>
+      </w:tblGrid>
+      <w:tr>
+        <w:tc>
+          <w:tcPr>
+            <w:tcW w:type="dxa" w:w="1991"/>
+            <w:tcBorders>
+              <w:top w:val="single" w:color="BFBFBF" w:sz="4"/>
+              <w:left w:val="single" w:color="BFBFBF" w:sz="4"/>
+              <w:bottom w:val="single" w:color="BFBFBF" w:sz="4"/>
+              <w:right w:val="single" w:color="BFBFBF" w:sz="4"/>
+            </w:tcBorders>
+            <w:shd w:fill="2F5496" w:val="clear"/>
+            <w:tcMar>
+              <w:top w:type="dxa" w:w="60"/>
+              <w:left w:type="dxa" w:w="100"/>
+              <w:bottom w:type="dxa" w:w="60"/>
+              <w:right w:type="dxa" w:w="100"/>
+            </w:tcMar>
+            <w:vAlign w:val="center"/>
+          </w:tcPr>
+          <w:p>
+            <w:pPr>
+              <w:jc w:val="left"/>
+            </w:pPr>
+            <w:r>
+              <w:rPr>
+                <w:b/>
+                <w:bCs/>
+                <w:color w:val="FFFFFF"/>
+                <w:sz w:val="19"/>
+                <w:szCs w:val="19"/>
+              </w:rPr>
+              <w:t xml:space="preserve">Round</w:t>
+            </w:r>
+          </w:p>
+        </w:tc>
+        <w:tc>
+          <w:tcPr>
+            <w:tcW w:type="dxa" w:w="1394"/>
+            <w:tcBorders>
+              <w:top w:val="single" w:color="BFBFBF" w:sz="4"/>
+              <w:left w:val="single" w:color="BFBFBF" w:sz="4"/>
+              <w:bottom w:val="single" w:color="BFBFBF" w:sz="4"/>
+              <w:right w:val="single" w:color="BFBFBF" w:sz="4"/>
+            </w:tcBorders>
+            <w:shd w:fill="2F5496" w:val="clear"/>
+            <w:tcMar>
+              <w:top w:type="dxa" w:w="60"/>
+              <w:left w:type="dxa" w:w="100"/>
+              <w:bottom w:type="dxa" w:w="60"/>
+              <w:right w:type="dxa" w:w="100"/>
+            </w:tcMar>
+            <w:vAlign w:val="center"/>
+          </w:tcPr>
+          <w:p>
+            <w:pPr>
+              <w:jc w:val="left"/>
+            </w:pPr>
+            <w:r>
+              <w:rPr>
+                <w:b/>
+                <w:bCs/>
+                <w:color w:val="FFFFFF"/>
+                <w:sz w:val="19"/>
+                <w:szCs w:val="19"/>
+              </w:rPr>
+              <w:t xml:space="preserve">Poses</w:t>
+            </w:r>
+          </w:p>
+        </w:tc>
+        <w:tc>
+          <w:tcPr>
+            <w:tcW w:type="dxa" w:w="1593"/>
+            <w:tcBorders>
+              <w:top w:val="single" w:color="BFBFBF" w:sz="4"/>
+              <w:left w:val="single" w:color="BFBFBF" w:sz="4"/>
+              <w:bottom w:val="single" w:color="BFBFBF" w:sz="4"/>
+              <w:right w:val="single" w:color="BFBFBF" w:sz="4"/>
+            </w:tcBorders>
+            <w:shd w:fill="2F5496" w:val="clear"/>
+            <w:tcMar>
+              <w:top w:type="dxa" w:w="60"/>
+              <w:left w:type="dxa" w:w="100"/>
+              <w:bottom w:type="dxa" w:w="60"/>
+              <w:right w:type="dxa" w:w="100"/>
+            </w:tcMar>
+            <w:vAlign w:val="center"/>
+          </w:tcPr>
+          <w:p>
+            <w:pPr>
+              <w:jc w:val="left"/>
+            </w:pPr>
+            <w:r>
+              <w:rPr>
+                <w:b/>
+                <w:bCs/>
+                <w:color w:val="FFFFFF"/>
+                <w:sz w:val="19"/>
+                <w:szCs w:val="19"/>
+              </w:rPr>
+              <w:t xml:space="preserve">|t|</w:t>
+            </w:r>
+          </w:p>
+        </w:tc>
+        <w:tc>
+          <w:tcPr>
+            <w:tcW w:type="dxa" w:w="4381"/>
+            <w:tcBorders>
+              <w:top w:val="single" w:color="BFBFBF" w:sz="4"/>
+              <w:left w:val="single" w:color="BFBFBF" w:sz="4"/>
+              <w:bottom w:val="single" w:color="BFBFBF" w:sz="4"/>
+              <w:right w:val="single" w:color="BFBFBF" w:sz="4"/>
+            </w:tcBorders>
+            <w:shd w:fill="2F5496" w:val="clear"/>
+            <w:tcMar>
+              <w:top w:type="dxa" w:w="60"/>
+              <w:left w:type="dxa" w:w="100"/>
+              <w:bottom w:type="dxa" w:w="60"/>
+              <w:right w:type="dxa" w:w="100"/>
+            </w:tcMar>
+            <w:vAlign w:val="center"/>
+          </w:tcPr>
+          <w:p>
+            <w:pPr>
+              <w:jc w:val="left"/>
+            </w:pPr>
+            <w:r>
+              <w:rPr>
+                <w:b/>
+                <w:bCs/>
+                <w:color w:val="FFFFFF"/>
+                <w:sz w:val="19"/>
+                <w:szCs w:val="19"/>
+              </w:rPr>
+              <w:t xml:space="preserve">Notes</w:t>
+            </w:r>
+          </w:p>
+        </w:tc>
+      </w:tr>
+      <w:tr>
+        <w:tc>
+          <w:tcPr>
+            <w:tcW w:type="dxa" w:w="1991"/>
+            <w:tcBorders>
+              <w:top w:val="single" w:color="BFBFBF" w:sz="4"/>
+              <w:left w:val="single" w:color="BFBFBF" w:sz="4"/>
+              <w:bottom w:val="single" w:color="BFBFBF" w:sz="4"/>
+              <w:right w:val="single" w:color="BFBFBF" w:sz="4"/>
+            </w:tcBorders>
+            <w:tcMar>
+              <w:top w:type="dxa" w:w="60"/>
+              <w:left w:type="dxa" w:w="100"/>
+              <w:bottom w:type="dxa" w:w="60"/>
+              <w:right w:type="dxa" w:w="100"/>
+            </w:tcMar>
+            <w:vAlign w:val="center"/>
+          </w:tcPr>
+          <w:p>
+            <w:pPr>
+              <w:jc w:val="left"/>
+            </w:pPr>
+            <w:r>
+              <w:rPr>
+                <w:sz w:val="19"/>
+                <w:szCs w:val="19"/>
+              </w:rPr>
+              <w:t xml:space="preserve">1 (no prior)</w:t>
+            </w:r>
+          </w:p>
+        </w:tc>
+        <w:tc>
+          <w:tcPr>
+            <w:tcW w:type="dxa" w:w="1394"/>
+            <w:tcBorders>
+              <w:top w:val="single" w:color="BFBFBF" w:sz="4"/>
+              <w:left w:val="single" w:color="BFBFBF" w:sz="4"/>
+              <w:bottom w:val="single" w:color="BFBFBF" w:sz="4"/>
+              <w:right w:val="single" w:color="BFBFBF" w:sz="4"/>
+            </w:tcBorders>
+            <w:tcMar>
+              <w:top w:type="dxa" w:w="60"/>
+              <w:left w:type="dxa" w:w="100"/>
+              <w:bottom w:type="dxa" w:w="60"/>
+              <w:right w:type="dxa" w:w="100"/>
+            </w:tcMar>
+            <w:vAlign w:val="center"/>
+          </w:tcPr>
+          <w:p>
+            <w:pPr>
+              <w:jc w:val="left"/>
+            </w:pPr>
+            <w:r>
+              <w:rPr>
+                <w:sz w:val="19"/>
+                <w:szCs w:val="19"/>
+              </w:rPr>
+              <w:t xml:space="preserve">11</w:t>
+            </w:r>
+          </w:p>
+        </w:tc>
+        <w:tc>
+          <w:tcPr>
+            <w:tcW w:type="dxa" w:w="1593"/>
+            <w:tcBorders>
+              <w:top w:val="single" w:color="BFBFBF" w:sz="4"/>
+              <w:left w:val="single" w:color="BFBFBF" w:sz="4"/>
+              <w:bottom w:val="single" w:color="BFBFBF" w:sz="4"/>
+              <w:right w:val="single" w:color="BFBFBF" w:sz="4"/>
+            </w:tcBorders>
+            <w:tcMar>
+              <w:top w:type="dxa" w:w="60"/>
+              <w:left w:type="dxa" w:w="100"/>
+              <w:bottom w:type="dxa" w:w="60"/>
+              <w:right w:type="dxa" w:w="100"/>
+            </w:tcMar>
+            <w:vAlign w:val="center"/>
+          </w:tcPr>
+          <w:p>
+            <w:pPr>
+              <w:jc w:val="left"/>
+            </w:pPr>
+            <w:r>
+              <w:rPr>
+                <w:sz w:val="19"/>
+                <w:szCs w:val="19"/>
+              </w:rPr>
+              <w:t xml:space="preserve">22.1 cm</w:t>
+            </w:r>
+          </w:p>
+        </w:tc>
+        <w:tc>
+          <w:tcPr>
+            <w:tcW w:type="dxa" w:w="4381"/>
+            <w:tcBorders>
+              <w:top w:val="single" w:color="BFBFBF" w:sz="4"/>
+              <w:left w:val="single" w:color="BFBFBF" w:sz="4"/>
+              <w:bottom w:val="single" w:color="BFBFBF" w:sz="4"/>
+              <w:right w:val="single" w:color="BFBFBF" w:sz="4"/>
+            </w:tcBorders>
+            <w:tcMar>
+              <w:top w:type="dxa" w:w="60"/>
+              <w:left w:type="dxa" w:w="100"/>
+              <w:bottom w:type="dxa" w:w="60"/>
+              <w:right w:type="dxa" w:w="100"/>
+            </w:tcMar>
+            <w:vAlign w:val="center"/>
+          </w:tcPr>
+          <w:p>
+            <w:pPr>
+              <w:jc w:val="left"/>
+            </w:pPr>
+            <w:r>
+              <w:rPr>
+                <w:sz w:val="19"/>
+                <w:szCs w:val="19"/>
+              </w:rPr>
+              <w:t xml:space="preserve">bootstrap; azimuth spread 18° too low → used only to seed a prior</w:t>
+            </w:r>
+          </w:p>
+        </w:tc>
+      </w:tr>
+      <w:tr>
+        <w:tc>
+          <w:tcPr>
+            <w:tcW w:type="dxa" w:w="1991"/>
+            <w:tcBorders>
+              <w:top w:val="single" w:color="BFBFBF" w:sz="4"/>
+              <w:left w:val="single" w:color="BFBFBF" w:sz="4"/>
+              <w:bottom w:val="single" w:color="BFBFBF" w:sz="4"/>
+              <w:right w:val="single" w:color="BFBFBF" w:sz="4"/>
+            </w:tcBorders>
+            <w:tcMar>
+              <w:top w:type="dxa" w:w="60"/>
+              <w:left w:type="dxa" w:w="100"/>
+              <w:bottom w:type="dxa" w:w="60"/>
+              <w:right w:type="dxa" w:w="100"/>
+            </w:tcMar>
+            <w:vAlign w:val="center"/>
+          </w:tcPr>
+          <w:p>
+            <w:pPr>
+              <w:jc w:val="left"/>
+            </w:pPr>
+            <w:r>
+              <w:rPr>
+                <w:sz w:val="19"/>
+                <w:szCs w:val="19"/>
+              </w:rPr>
+              <w:t xml:space="preserve">2 (with prior)</w:t>
+            </w:r>
+          </w:p>
+        </w:tc>
+        <w:tc>
+          <w:tcPr>
+            <w:tcW w:type="dxa" w:w="1394"/>
+            <w:tcBorders>
+              <w:top w:val="single" w:color="BFBFBF" w:sz="4"/>
+              <w:left w:val="single" w:color="BFBFBF" w:sz="4"/>
+              <w:bottom w:val="single" w:color="BFBFBF" w:sz="4"/>
+              <w:right w:val="single" w:color="BFBFBF" w:sz="4"/>
+            </w:tcBorders>
+            <w:tcMar>
+              <w:top w:type="dxa" w:w="60"/>
+              <w:left w:type="dxa" w:w="100"/>
+              <w:bottom w:type="dxa" w:w="60"/>
+              <w:right w:type="dxa" w:w="100"/>
+            </w:tcMar>
+            <w:vAlign w:val="center"/>
+          </w:tcPr>
+          <w:p>
+            <w:pPr>
+              <w:jc w:val="left"/>
+            </w:pPr>
+            <w:r>
+              <w:rPr>
+                <w:sz w:val="19"/>
+                <w:szCs w:val="19"/>
+              </w:rPr>
+              <w:t xml:space="preserve">15</w:t>
+            </w:r>
+          </w:p>
+        </w:tc>
+        <w:tc>
+          <w:tcPr>
+            <w:tcW w:type="dxa" w:w="1593"/>
+            <w:tcBorders>
+              <w:top w:val="single" w:color="BFBFBF" w:sz="4"/>
+              <w:left w:val="single" w:color="BFBFBF" w:sz="4"/>
+              <w:bottom w:val="single" w:color="BFBFBF" w:sz="4"/>
+              <w:right w:val="single" w:color="BFBFBF" w:sz="4"/>
+            </w:tcBorders>
+            <w:tcMar>
+              <w:top w:type="dxa" w:w="60"/>
+              <w:left w:type="dxa" w:w="100"/>
+              <w:bottom w:type="dxa" w:w="60"/>
+              <w:right w:type="dxa" w:w="100"/>
+            </w:tcMar>
+            <w:vAlign w:val="center"/>
+          </w:tcPr>
+          <w:p>
+            <w:pPr>
+              <w:jc w:val="left"/>
+            </w:pPr>
+            <w:r>
+              <w:rPr>
+                <w:sz w:val="19"/>
+                <w:szCs w:val="19"/>
+              </w:rPr>
+              <w:t xml:space="preserve">13.9 cm</w:t>
+            </w:r>
+          </w:p>
+        </w:tc>
+        <w:tc>
+          <w:tcPr>
+            <w:tcW w:type="dxa" w:w="4381"/>
+            <w:tcBorders>
+              <w:top w:val="single" w:color="BFBFBF" w:sz="4"/>
+              <w:left w:val="single" w:color="BFBFBF" w:sz="4"/>
+              <w:bottom w:val="single" w:color="BFBFBF" w:sz="4"/>
+              <w:right w:val="single" w:color="BFBFBF" w:sz="4"/>
+            </w:tcBorders>
+            <w:tcMar>
+              <w:top w:type="dxa" w:w="60"/>
+              <w:left w:type="dxa" w:w="100"/>
+              <w:bottom w:type="dxa" w:w="60"/>
+              <w:right w:type="dxa" w:w="100"/>
+            </w:tcMar>
+            <w:vAlign w:val="center"/>
+          </w:tcPr>
+          <w:p>
+            <w:pPr>
+              <w:jc w:val="left"/>
+            </w:pPr>
+            <w:r>
+              <w:rPr>
+                <w:sz w:val="19"/>
+                <w:szCs w:val="19"/>
+              </w:rPr>
+              <w:t xml:space="preserve">t_x still floating (−14 → +12 cm across attempts) — blind axis</w:t>
+            </w:r>
+          </w:p>
+        </w:tc>
+      </w:tr>
+      <w:tr>
+        <w:tc>
+          <w:tcPr>
+            <w:tcW w:type="dxa" w:w="1991"/>
+            <w:tcBorders>
+              <w:top w:val="single" w:color="BFBFBF" w:sz="4"/>
+              <w:left w:val="single" w:color="BFBFBF" w:sz="4"/>
+              <w:bottom w:val="single" w:color="BFBFBF" w:sz="4"/>
+              <w:right w:val="single" w:color="BFBFBF" w:sz="4"/>
+            </w:tcBorders>
+            <w:tcMar>
+              <w:top w:type="dxa" w:w="60"/>
+              <w:left w:type="dxa" w:w="100"/>
+              <w:bottom w:type="dxa" w:w="60"/>
+              <w:right w:type="dxa" w:w="100"/>
+            </w:tcMar>
+            <w:vAlign w:val="center"/>
+          </w:tcPr>
+          <w:p>
+            <w:pPr>
+              <w:jc w:val="left"/>
+            </w:pPr>
+            <w:r>
+              <w:rPr>
+                <w:sz w:val="19"/>
+                <w:szCs w:val="19"/>
+              </w:rPr>
+              <w:t xml:space="preserve">3 / final</w:t>
+            </w:r>
+          </w:p>
+        </w:tc>
+        <w:tc>
+          <w:tcPr>
+            <w:tcW w:type="dxa" w:w="1394"/>
+            <w:tcBorders>
+              <w:top w:val="single" w:color="BFBFBF" w:sz="4"/>
+              <w:left w:val="single" w:color="BFBFBF" w:sz="4"/>
+              <w:bottom w:val="single" w:color="BFBFBF" w:sz="4"/>
+              <w:right w:val="single" w:color="BFBFBF" w:sz="4"/>
+            </w:tcBorders>
+            <w:tcMar>
+              <w:top w:type="dxa" w:w="60"/>
+              <w:left w:type="dxa" w:w="100"/>
+              <w:bottom w:type="dxa" w:w="60"/>
+              <w:right w:type="dxa" w:w="100"/>
+            </w:tcMar>
+            <w:vAlign w:val="center"/>
+          </w:tcPr>
+          <w:p>
+            <w:pPr>
+              <w:jc w:val="left"/>
+            </w:pPr>
+            <w:r>
+              <w:rPr>
+                <w:sz w:val="19"/>
+                <w:szCs w:val="19"/>
+              </w:rPr>
+              <w:t xml:space="preserve">30</w:t>
+            </w:r>
+          </w:p>
+        </w:tc>
+        <w:tc>
+          <w:tcPr>
+            <w:tcW w:type="dxa" w:w="1593"/>
+            <w:tcBorders>
+              <w:top w:val="single" w:color="BFBFBF" w:sz="4"/>
+              <w:left w:val="single" w:color="BFBFBF" w:sz="4"/>
+              <w:bottom w:val="single" w:color="BFBFBF" w:sz="4"/>
+              <w:right w:val="single" w:color="BFBFBF" w:sz="4"/>
+            </w:tcBorders>
+            <w:tcMar>
+              <w:top w:type="dxa" w:w="60"/>
+              <w:left w:type="dxa" w:w="100"/>
+              <w:bottom w:type="dxa" w:w="60"/>
+              <w:right w:type="dxa" w:w="100"/>
+            </w:tcMar>
+            <w:vAlign w:val="center"/>
+          </w:tcPr>
+          <w:p>
+            <w:pPr>
+              <w:jc w:val="left"/>
+            </w:pPr>
+            <w:r>
+              <w:rPr>
+                <w:sz w:val="19"/>
+                <w:szCs w:val="19"/>
+              </w:rPr>
+              <w:t xml:space="preserve">10.1 cm</w:t>
+            </w:r>
+          </w:p>
+        </w:tc>
+        <w:tc>
+          <w:tcPr>
+            <w:tcW w:type="dxa" w:w="4381"/>
+            <w:tcBorders>
+              <w:top w:val="single" w:color="BFBFBF" w:sz="4"/>
+              <w:left w:val="single" w:color="BFBFBF" w:sz="4"/>
+              <w:bottom w:val="single" w:color="BFBFBF" w:sz="4"/>
+              <w:right w:val="single" w:color="BFBFBF" w:sz="4"/>
+            </w:tcBorders>
+            <w:tcMar>
+              <w:top w:type="dxa" w:w="60"/>
+              <w:left w:type="dxa" w:w="100"/>
+              <w:bottom w:type="dxa" w:w="60"/>
+              <w:right w:type="dxa" w:w="100"/>
+            </w:tcMar>
+            <w:vAlign w:val="center"/>
+          </w:tcPr>
+          <w:p>
+            <w:pPr>
+              <w:jc w:val="left"/>
+            </w:pPr>
+            <w:r>
+              <w:rPr>
+                <w:sz w:val="19"/>
+                <w:szCs w:val="19"/>
+              </w:rPr>
+              <w:t xml:space="preserve">t_x pinned to tape (−0.10 m), bias ≈ 1 mm, azimuth 36° ✓</w:t>
             </w:r>
           </w:p>
         </w:tc>
@@ -5517,7 +8267,7 @@
         <w:spacing w:after="140" w:before="280"/>
       </w:pPr>
       <w:r>
-        <w:t xml:space="preserve">5.3 Radar_Infra</w:t>
+        <w:t xml:space="preserve">5.3 ZED ↔ Radar_Infra</w:t>
       </w:r>
     </w:p>
     <w:p>
@@ -5525,7 +8275,7 @@
         <w:spacing w:after="160"/>
       </w:pPr>
       <w:r>
-        <w:t xml:space="preserve">Status: ROUND 1 BOOTSTRAP ONLY — not final. This radar has not yet completed the standardized protocol and its extrinsic must not be treated as deployable.</w:t>
+        <w:t xml:space="preserve">Status: ROUND 1 BOOTSTRAP ONLY — not final, and the only result on record for this radar. It has not yet completed the standardized protocol and its extrinsic must not be treated as deployable.</w:t>
       </w:r>
     </w:p>
     <w:tbl>
@@ -5796,6 +8546,68 @@
                 <w:szCs w:val="19"/>
               </w:rPr>
               <w:t xml:space="preserve">[−0.4735, −0.4611, −0.4587, +0.5939]</w:t>
+            </w:r>
+          </w:p>
+        </w:tc>
+      </w:tr>
+      <w:tr>
+        <w:tc>
+          <w:tcPr>
+            <w:tcW w:type="dxa" w:w="4160"/>
+            <w:tcBorders>
+              <w:top w:val="single" w:color="BFBFBF" w:sz="4"/>
+              <w:left w:val="single" w:color="BFBFBF" w:sz="4"/>
+              <w:bottom w:val="single" w:color="BFBFBF" w:sz="4"/>
+              <w:right w:val="single" w:color="BFBFBF" w:sz="4"/>
+            </w:tcBorders>
+            <w:tcMar>
+              <w:top w:type="dxa" w:w="60"/>
+              <w:left w:type="dxa" w:w="100"/>
+              <w:bottom w:type="dxa" w:w="60"/>
+              <w:right w:type="dxa" w:w="100"/>
+            </w:tcMar>
+            <w:vAlign w:val="center"/>
+          </w:tcPr>
+          <w:p>
+            <w:pPr>
+              <w:jc w:val="left"/>
+            </w:pPr>
+            <w:r>
+              <w:rPr>
+                <w:sz w:val="19"/>
+                <w:szCs w:val="19"/>
+              </w:rPr>
+              <w:t xml:space="preserve">rpy (deg)</w:t>
+            </w:r>
+          </w:p>
+        </w:tc>
+        <w:tc>
+          <w:tcPr>
+            <w:tcW w:type="dxa" w:w="5200"/>
+            <w:tcBorders>
+              <w:top w:val="single" w:color="BFBFBF" w:sz="4"/>
+              <w:left w:val="single" w:color="BFBFBF" w:sz="4"/>
+              <w:bottom w:val="single" w:color="BFBFBF" w:sz="4"/>
+              <w:right w:val="single" w:color="BFBFBF" w:sz="4"/>
+            </w:tcBorders>
+            <w:tcMar>
+              <w:top w:type="dxa" w:w="60"/>
+              <w:left w:type="dxa" w:w="100"/>
+              <w:bottom w:type="dxa" w:w="60"/>
+              <w:right w:type="dxa" w:w="100"/>
+            </w:tcMar>
+            <w:vAlign w:val="center"/>
+          </w:tcPr>
+          <w:p>
+            <w:pPr>
+              <w:jc w:val="left"/>
+            </w:pPr>
+            <w:r>
+              <w:rPr>
+                <w:sz w:val="19"/>
+                <w:szCs w:val="19"/>
+              </w:rPr>
+              <w:t xml:space="preserve">[−47.79, −79.16, −35.13]</w:t>
             </w:r>
           </w:p>
         </w:tc>
@@ -6112,6 +8924,23 @@
       </w:pPr>
       <w:r>
         <w:t xml:space="preserve">Enable session logging on the round-2 run — round 1's individual pose captures were not logged, so there is currently no offline reproducibility check for radar_infra as there is for radar1/radar2.</w:t>
+      </w:r>
+    </w:p>
+    <w:p>
+      <w:pPr>
+        <w:pStyle w:val="Heading2"/>
+        <w:spacing w:after="140" w:before="280"/>
+      </w:pPr>
+      <w:r>
+        <w:t xml:space="preserve">5.4 Arducam ↔ Any Radar</w:t>
+      </w:r>
+    </w:p>
+    <w:p>
+      <w:pPr>
+        <w:spacing w:after="160"/>
+      </w:pPr>
+      <w:r>
+        <w:t xml:space="preserve">No calibration session has been run or logged against the Arducam profile for any of the three radars. The code path (radar_camera_calib_arducam.py: the static profile with rectify_image:=true, in-node undistortion from camera_info) is implemented and shares the identical frozen block, estimator, and gates from Section 3 — so once real Arducam topic names and an optical-frame id are supplied, the same procedure applies unchanged. Until a session is run and archived under sessions/, there are no Arducam numeric results to report.</w:t>
       </w:r>
     </w:p>
     <w:p>
@@ -11830,7 +14659,7 @@
         </w:numPr>
         <w:spacing w:after="80"/>
       </w:pPr>
-      <w:hyperlink w:history="1" r:id="rIdcbsxe2b4snqv__odgaonc">
+      <w:hyperlink w:history="1" r:id="rIdpppjxrhg5ypz9bkyrqyk7">
         <w:r>
           <w:rPr>
             <w:rStyle w:val="Hyperlink"/>
@@ -11848,7 +14677,7 @@
         </w:numPr>
         <w:spacing w:after="80"/>
       </w:pPr>
-      <w:hyperlink w:history="1" r:id="rIdo1brs-995u4wwbtkr249p">
+      <w:hyperlink w:history="1" r:id="rIdzzacn6aytzrlfpvwnupjp">
         <w:r>
           <w:rPr>
             <w:rStyle w:val="Hyperlink"/>
@@ -11866,7 +14695,7 @@
         </w:numPr>
         <w:spacing w:after="80"/>
       </w:pPr>
-      <w:hyperlink w:history="1" r:id="rIdw8kt_0hiuqgevhbqtdtxl">
+      <w:hyperlink w:history="1" r:id="rIdbkpiyquel58xppdgufccc">
         <w:r>
           <w:rPr>
             <w:rStyle w:val="Hyperlink"/>
@@ -11884,7 +14713,7 @@
         </w:numPr>
         <w:spacing w:after="80"/>
       </w:pPr>
-      <w:hyperlink w:history="1" r:id="rIdy56c-2mxthym8sars8z0s">
+      <w:hyperlink w:history="1" r:id="rIdjb-mrv1en_hwwsrxsusrs">
         <w:r>
           <w:rPr>
             <w:rStyle w:val="Hyperlink"/>
@@ -11902,7 +14731,7 @@
         </w:numPr>
         <w:spacing w:after="80"/>
       </w:pPr>
-      <w:hyperlink w:history="1" r:id="rIdbqtv_cy3spb2iu7vikm_5">
+      <w:hyperlink w:history="1" r:id="rIdyouy3kfydb6wvovwkedqb">
         <w:r>
           <w:rPr>
             <w:rStyle w:val="Hyperlink"/>
@@ -11920,7 +14749,7 @@
         </w:numPr>
         <w:spacing w:after="80"/>
       </w:pPr>
-      <w:hyperlink w:history="1" r:id="rId0xhpx0dhsckqfhla8j2ac">
+      <w:hyperlink w:history="1" r:id="rId_n3n0yr9swo_cn-yiwwel">
         <w:r>
           <w:rPr>
             <w:rStyle w:val="Hyperlink"/>
@@ -11938,7 +14767,7 @@
         </w:numPr>
         <w:spacing w:after="80"/>
       </w:pPr>
-      <w:hyperlink w:history="1" r:id="rIdmr50wyqnijgbkvbb-dv18">
+      <w:hyperlink w:history="1" r:id="rIdboobrmd3ihbzfkgvxjfwp">
         <w:r>
           <w:rPr>
             <w:rStyle w:val="Hyperlink"/>
@@ -11956,7 +14785,7 @@
         </w:numPr>
         <w:spacing w:after="80"/>
       </w:pPr>
-      <w:hyperlink w:history="1" r:id="rIdss_f37fg5babuesjyvrrt">
+      <w:hyperlink w:history="1" r:id="rIdzglun4eycylt0bav4knk_">
         <w:r>
           <w:rPr>
             <w:rStyle w:val="Hyperlink"/>
@@ -11974,7 +14803,7 @@
         </w:numPr>
         <w:spacing w:after="80"/>
       </w:pPr>
-      <w:hyperlink w:history="1" r:id="rId5q7am9wcgcraw1fp2ujj-">
+      <w:hyperlink w:history="1" r:id="rIdbygpluis_jfijwxivw12e">
         <w:r>
           <w:rPr>
             <w:rStyle w:val="Hyperlink"/>
@@ -11992,7 +14821,7 @@
         </w:numPr>
         <w:spacing w:after="80"/>
       </w:pPr>
-      <w:hyperlink w:history="1" r:id="rIdebunaayo5soayhybfpcju">
+      <w:hyperlink w:history="1" r:id="rId-qsp3szjauoumz7dml3wu">
         <w:r>
           <w:rPr>
             <w:rStyle w:val="Hyperlink"/>
@@ -12010,7 +14839,7 @@
         </w:numPr>
         <w:spacing w:after="80"/>
       </w:pPr>
-      <w:hyperlink w:history="1" r:id="rIdicirnftfsgiiz_romsrdt">
+      <w:hyperlink w:history="1" r:id="rIde5hcn1rzcb-bl5albs5mk">
         <w:r>
           <w:rPr>
             <w:rStyle w:val="Hyperlink"/>
@@ -12028,7 +14857,7 @@
         </w:numPr>
         <w:spacing w:after="80"/>
       </w:pPr>
-      <w:hyperlink w:history="1" r:id="rIdvs1vqxyvmwekkdhykvhhs">
+      <w:hyperlink w:history="1" r:id="rIdggjk7cwfc5bcdhodcwtdb">
         <w:r>
           <w:rPr>
             <w:rStyle w:val="Hyperlink"/>
@@ -12046,7 +14875,7 @@
         </w:numPr>
         <w:spacing w:after="80"/>
       </w:pPr>
-      <w:hyperlink w:history="1" r:id="rId0x3anhtgrwfvwsmjionl9">
+      <w:hyperlink w:history="1" r:id="rId92sprxc1z8wckzygqo3kd">
         <w:r>
           <w:rPr>
             <w:rStyle w:val="Hyperlink"/>
@@ -12064,7 +14893,7 @@
         </w:numPr>
         <w:spacing w:after="80"/>
       </w:pPr>
-      <w:hyperlink w:history="1" r:id="rIdxsvrebue3s7ok-hoi7gib">
+      <w:hyperlink w:history="1" r:id="rIdeezs9yayrd0oo7s3cgh4k">
         <w:r>
           <w:rPr>
             <w:rStyle w:val="Hyperlink"/>
@@ -12082,7 +14911,7 @@
         </w:numPr>
         <w:spacing w:after="80"/>
       </w:pPr>
-      <w:hyperlink w:history="1" r:id="rIdup5qmpngwjdtorlvlkuln">
+      <w:hyperlink w:history="1" r:id="rId0clbsjangcwhiywaxtqtj">
         <w:r>
           <w:rPr>
             <w:rStyle w:val="Hyperlink"/>
@@ -12100,7 +14929,7 @@
         </w:numPr>
         <w:spacing w:after="80"/>
       </w:pPr>
-      <w:hyperlink w:history="1" r:id="rIdsu3yewaaqvykokgqqa9fr">
+      <w:hyperlink w:history="1" r:id="rIdlhlnfq8wd_2yt0mrn67kn">
         <w:r>
           <w:rPr>
             <w:rStyle w:val="Hyperlink"/>
@@ -12118,7 +14947,7 @@
         </w:numPr>
         <w:spacing w:after="80"/>
       </w:pPr>
-      <w:hyperlink w:history="1" r:id="rIdjbyt7dyxlifcc9fieuk7y">
+      <w:hyperlink w:history="1" r:id="rIdglezpk0jeqojmkdyycxkg">
         <w:r>
           <w:rPr>
             <w:rStyle w:val="Hyperlink"/>
@@ -12136,7 +14965,7 @@
         </w:numPr>
         <w:spacing w:after="80"/>
       </w:pPr>
-      <w:hyperlink w:history="1" r:id="rIdfofiyy2egh6gl6jnncraj">
+      <w:hyperlink w:history="1" r:id="rIdiw0sj8xrilunud8u-cuo0">
         <w:r>
           <w:rPr>
             <w:rStyle w:val="Hyperlink"/>

</xml_diff>